<commit_message>
UML empezado a comentar
</commit_message>
<xml_diff>
--- a/AppChat-entrega1.docx
+++ b/AppChat-entrega1.docx
@@ -1,6 +1,6 @@
 
 <file path=word/document.xml><?xml version="1.0" encoding="utf-8"?>
-<w:document xmlns:wpc="http://schemas.microsoft.com/office/word/2010/wordprocessingCanvas" xmlns:cx="http://schemas.microsoft.com/office/drawing/2014/chartex" xmlns:cx1="http://schemas.microsoft.com/office/drawing/2015/9/8/chartex" xmlns:cx2="http://schemas.microsoft.com/office/drawing/2015/10/21/chartex" xmlns:cx3="http://schemas.microsoft.com/office/drawing/2016/5/9/chartex" xmlns:cx4="http://schemas.microsoft.com/office/drawing/2016/5/10/chartex" xmlns:cx5="http://schemas.microsoft.com/office/drawing/2016/5/11/chartex" xmlns:cx6="http://schemas.microsoft.com/office/drawing/2016/5/12/chartex" xmlns:cx7="http://schemas.microsoft.com/office/drawing/2016/5/13/chartex" xmlns:cx8="http://schemas.microsoft.com/office/drawing/2016/5/14/chartex" xmlns:mc="http://schemas.openxmlformats.org/markup-compatibility/2006" xmlns:aink="http://schemas.microsoft.com/office/drawing/2016/ink" xmlns:am3d="http://schemas.microsoft.com/office/drawing/2017/model3d" xmlns:o="urn:schemas-microsoft-com:office:office" xmlns:oel="http://schemas.microsoft.com/office/2019/extlst" xmlns:r="http://schemas.openxmlformats.org/officeDocument/2006/relationships" xmlns:m="http://schemas.openxmlformats.org/officeDocument/2006/math" xmlns:v="urn:schemas-microsoft-com:vml" xmlns:wp14="http://schemas.microsoft.com/office/word/2010/wordprocessingDrawing" xmlns:wp="http://schemas.openxmlformats.org/drawingml/2006/wordprocessingDrawing" xmlns:w10="urn:schemas-microsoft-com:office:word" xmlns:w="http://schemas.openxmlformats.org/wordprocessingml/2006/main" xmlns:w14="http://schemas.microsoft.com/office/word/2010/wordml" xmlns:w15="http://schemas.microsoft.com/office/word/2012/wordml" xmlns:w16cex="http://schemas.microsoft.com/office/word/2018/wordml/cex" xmlns:w16cid="http://schemas.microsoft.com/office/word/2016/wordml/cid" xmlns:w16="http://schemas.microsoft.com/office/word/2018/wordml" xmlns:w16du="http://schemas.microsoft.com/office/word/2023/wordml/word16du" xmlns:w16sdtdh="http://schemas.microsoft.com/office/word/2020/wordml/sdtdatahash" xmlns:w16se="http://schemas.microsoft.com/office/word/2015/wordml/symex" xmlns:wpg="http://schemas.microsoft.com/office/word/2010/wordprocessingGroup" xmlns:wpi="http://schemas.microsoft.com/office/word/2010/wordprocessingInk" xmlns:wne="http://schemas.microsoft.com/office/word/2006/wordml" xmlns:wps="http://schemas.microsoft.com/office/word/2010/wordprocessingShape" mc:Ignorable="w14 w15 w16se w16cid w16 w16cex w16sdtdh w16du wp14">
+<w:document xmlns:wpc="http://schemas.microsoft.com/office/word/2010/wordprocessingCanvas" xmlns:cx="http://schemas.microsoft.com/office/drawing/2014/chartex" xmlns:mc="http://schemas.openxmlformats.org/markup-compatibility/2006" xmlns:o="urn:schemas-microsoft-com:office:office" xmlns:r="http://schemas.openxmlformats.org/officeDocument/2006/relationships" xmlns:m="http://schemas.openxmlformats.org/officeDocument/2006/math" xmlns:v="urn:schemas-microsoft-com:vml" xmlns:wp14="http://schemas.microsoft.com/office/word/2010/wordprocessingDrawing" xmlns:wp="http://schemas.openxmlformats.org/drawingml/2006/wordprocessingDrawing" xmlns:w10="urn:schemas-microsoft-com:office:word" xmlns:w="http://schemas.openxmlformats.org/wordprocessingml/2006/main" xmlns:w14="http://schemas.microsoft.com/office/word/2010/wordml" xmlns:w15="http://schemas.microsoft.com/office/word/2012/wordml" xmlns:w16se="http://schemas.microsoft.com/office/word/2015/wordml/symex" xmlns:wpg="http://schemas.microsoft.com/office/word/2010/wordprocessingGroup" xmlns:wpi="http://schemas.microsoft.com/office/word/2010/wordprocessingInk" xmlns:wne="http://schemas.microsoft.com/office/word/2006/wordml" xmlns:wps="http://schemas.microsoft.com/office/word/2010/wordprocessingShape" mc:Ignorable="w14 w15 w16se wp14">
   <w:body>
     <w:p>
       <w:r>
@@ -9,21 +9,10 @@
     </w:p>
     <w:p>
       <w:r>
-        <w:t xml:space="preserve">Ana </w:t>
-      </w:r>
-      <w:r>
-        <w:t>Martínez</w:t>
-      </w:r>
-      <w:r>
-        <w:t xml:space="preserve"> </w:t>
-      </w:r>
-      <w:proofErr w:type="spellStart"/>
-      <w:r>
-        <w:t>Garcia</w:t>
-      </w:r>
-      <w:proofErr w:type="spellEnd"/>
-      <w:r>
-        <w:t>; Grupo 2.1</w:t>
+        <w:t>Ana Martínez Garcí</w:t>
+      </w:r>
+      <w:r>
+        <w:t>a; Grupo 2.1</w:t>
       </w:r>
     </w:p>
     <w:p>
@@ -341,7 +330,6 @@
     </w:p>
     <w:p>
       <w:pPr>
-        <w:ind w:left="708" w:hanging="708"/>
         <w:rPr>
           <w:sz w:val="24"/>
           <w:szCs w:val="24"/>
@@ -350,6 +338,21 @@
       <w:r>
         <w:rPr>
           <w:sz w:val="24"/>
+          <w:szCs w:val="24"/>
+        </w:rPr>
+        <w:br w:type="page"/>
+      </w:r>
+    </w:p>
+    <w:p>
+      <w:pPr>
+        <w:rPr>
+          <w:sz w:val="28"/>
+          <w:szCs w:val="24"/>
+        </w:rPr>
+      </w:pPr>
+      <w:r>
+        <w:rPr>
+          <w:sz w:val="28"/>
           <w:szCs w:val="24"/>
         </w:rPr>
         <w:lastRenderedPageBreak/>
@@ -358,12 +361,380 @@
     </w:p>
     <w:p>
       <w:pPr>
+        <w:pStyle w:val="TDC1"/>
+        <w:tabs>
+          <w:tab w:val="right" w:leader="dot" w:pos="8494"/>
+        </w:tabs>
+        <w:rPr>
+          <w:noProof/>
+        </w:rPr>
+      </w:pPr>
+      <w:r>
+        <w:rPr>
+          <w:sz w:val="24"/>
+          <w:szCs w:val="24"/>
+        </w:rPr>
+        <w:fldChar w:fldCharType="begin"/>
+      </w:r>
+      <w:r>
+        <w:rPr>
+          <w:sz w:val="24"/>
+          <w:szCs w:val="24"/>
+        </w:rPr>
+        <w:instrText xml:space="preserve"> TOC \o "1-3" \h \z \u </w:instrText>
+      </w:r>
+      <w:r>
+        <w:rPr>
+          <w:sz w:val="24"/>
+          <w:szCs w:val="24"/>
+        </w:rPr>
+        <w:fldChar w:fldCharType="separate"/>
+      </w:r>
+      <w:hyperlink w:anchor="_Toc179983215" w:history="1">
+        <w:r>
+          <w:rPr>
+            <w:rStyle w:val="Hipervnculo"/>
+            <w:noProof/>
+          </w:rPr>
+          <w:t>User Story Mapping</w:t>
+        </w:r>
+        <w:r>
+          <w:rPr>
+            <w:noProof/>
+            <w:webHidden/>
+          </w:rPr>
+          <w:tab/>
+        </w:r>
+        <w:r>
+          <w:rPr>
+            <w:noProof/>
+            <w:webHidden/>
+          </w:rPr>
+          <w:fldChar w:fldCharType="begin"/>
+        </w:r>
+        <w:r>
+          <w:rPr>
+            <w:noProof/>
+            <w:webHidden/>
+          </w:rPr>
+          <w:instrText xml:space="preserve"> PAGEREF _Toc179983215 \h </w:instrText>
+        </w:r>
+        <w:r>
+          <w:rPr>
+            <w:noProof/>
+            <w:webHidden/>
+          </w:rPr>
+        </w:r>
+        <w:r>
+          <w:rPr>
+            <w:noProof/>
+            <w:webHidden/>
+          </w:rPr>
+          <w:fldChar w:fldCharType="separate"/>
+        </w:r>
+        <w:r>
+          <w:rPr>
+            <w:noProof/>
+            <w:webHidden/>
+          </w:rPr>
+          <w:t>3</w:t>
+        </w:r>
+        <w:r>
+          <w:rPr>
+            <w:noProof/>
+            <w:webHidden/>
+          </w:rPr>
+          <w:fldChar w:fldCharType="end"/>
+        </w:r>
+      </w:hyperlink>
+    </w:p>
+    <w:p>
+      <w:pPr>
+        <w:pStyle w:val="TDC1"/>
+        <w:tabs>
+          <w:tab w:val="right" w:leader="dot" w:pos="8494"/>
+        </w:tabs>
+        <w:rPr>
+          <w:noProof/>
+        </w:rPr>
+      </w:pPr>
+      <w:hyperlink w:anchor="_Toc179983216" w:history="1">
+        <w:r>
+          <w:rPr>
+            <w:rStyle w:val="Hipervnculo"/>
+            <w:noProof/>
+          </w:rPr>
+          <w:t>Historias de usuario</w:t>
+        </w:r>
+        <w:r>
+          <w:rPr>
+            <w:noProof/>
+            <w:webHidden/>
+          </w:rPr>
+          <w:tab/>
+        </w:r>
+        <w:r>
+          <w:rPr>
+            <w:noProof/>
+            <w:webHidden/>
+          </w:rPr>
+          <w:fldChar w:fldCharType="begin"/>
+        </w:r>
+        <w:r>
+          <w:rPr>
+            <w:noProof/>
+            <w:webHidden/>
+          </w:rPr>
+          <w:instrText xml:space="preserve"> PAGEREF _Toc179983216 \h </w:instrText>
+        </w:r>
+        <w:r>
+          <w:rPr>
+            <w:noProof/>
+            <w:webHidden/>
+          </w:rPr>
+        </w:r>
+        <w:r>
+          <w:rPr>
+            <w:noProof/>
+            <w:webHidden/>
+          </w:rPr>
+          <w:fldChar w:fldCharType="separate"/>
+        </w:r>
+        <w:r>
+          <w:rPr>
+            <w:noProof/>
+            <w:webHidden/>
+          </w:rPr>
+          <w:t>4</w:t>
+        </w:r>
+        <w:r>
+          <w:rPr>
+            <w:noProof/>
+            <w:webHidden/>
+          </w:rPr>
+          <w:fldChar w:fldCharType="end"/>
+        </w:r>
+      </w:hyperlink>
+    </w:p>
+    <w:p>
+      <w:pPr>
+        <w:pStyle w:val="TDC1"/>
+        <w:tabs>
+          <w:tab w:val="right" w:leader="dot" w:pos="8494"/>
+        </w:tabs>
+        <w:rPr>
+          <w:noProof/>
+        </w:rPr>
+      </w:pPr>
+      <w:hyperlink w:anchor="_Toc179983217" w:history="1">
+        <w:r>
+          <w:rPr>
+            <w:rStyle w:val="Hipervnculo"/>
+            <w:noProof/>
+          </w:rPr>
+          <w:t>Requisitos NO funcionales</w:t>
+        </w:r>
+        <w:r>
+          <w:rPr>
+            <w:noProof/>
+            <w:webHidden/>
+          </w:rPr>
+          <w:tab/>
+        </w:r>
+        <w:r>
+          <w:rPr>
+            <w:noProof/>
+            <w:webHidden/>
+          </w:rPr>
+          <w:fldChar w:fldCharType="begin"/>
+        </w:r>
+        <w:r>
+          <w:rPr>
+            <w:noProof/>
+            <w:webHidden/>
+          </w:rPr>
+          <w:instrText xml:space="preserve"> PAGEREF _Toc179983217 \h </w:instrText>
+        </w:r>
+        <w:r>
+          <w:rPr>
+            <w:noProof/>
+            <w:webHidden/>
+          </w:rPr>
+        </w:r>
+        <w:r>
+          <w:rPr>
+            <w:noProof/>
+            <w:webHidden/>
+          </w:rPr>
+          <w:fldChar w:fldCharType="separate"/>
+        </w:r>
+        <w:r>
+          <w:rPr>
+            <w:noProof/>
+            <w:webHidden/>
+          </w:rPr>
+          <w:t>6</w:t>
+        </w:r>
+        <w:r>
+          <w:rPr>
+            <w:noProof/>
+            <w:webHidden/>
+          </w:rPr>
+          <w:fldChar w:fldCharType="end"/>
+        </w:r>
+      </w:hyperlink>
+    </w:p>
+    <w:p>
+      <w:pPr>
+        <w:pStyle w:val="TDC1"/>
+        <w:tabs>
+          <w:tab w:val="right" w:leader="dot" w:pos="8494"/>
+        </w:tabs>
+        <w:rPr>
+          <w:noProof/>
+        </w:rPr>
+      </w:pPr>
+      <w:hyperlink w:anchor="_Toc179983218" w:history="1">
+        <w:r>
+          <w:rPr>
+            <w:rStyle w:val="Hipervnculo"/>
+            <w:noProof/>
+          </w:rPr>
+          <w:t>Diagrama de clases (UML)</w:t>
+        </w:r>
+        <w:r>
+          <w:rPr>
+            <w:noProof/>
+            <w:webHidden/>
+          </w:rPr>
+          <w:tab/>
+        </w:r>
+        <w:r>
+          <w:rPr>
+            <w:noProof/>
+            <w:webHidden/>
+          </w:rPr>
+          <w:fldChar w:fldCharType="begin"/>
+        </w:r>
+        <w:r>
+          <w:rPr>
+            <w:noProof/>
+            <w:webHidden/>
+          </w:rPr>
+          <w:instrText xml:space="preserve"> PAGEREF _Toc179983218 \h </w:instrText>
+        </w:r>
+        <w:r>
+          <w:rPr>
+            <w:noProof/>
+            <w:webHidden/>
+          </w:rPr>
+        </w:r>
+        <w:r>
+          <w:rPr>
+            <w:noProof/>
+            <w:webHidden/>
+          </w:rPr>
+          <w:fldChar w:fldCharType="separate"/>
+        </w:r>
+        <w:r>
+          <w:rPr>
+            <w:noProof/>
+            <w:webHidden/>
+          </w:rPr>
+          <w:t>7</w:t>
+        </w:r>
+        <w:r>
+          <w:rPr>
+            <w:noProof/>
+            <w:webHidden/>
+          </w:rPr>
+          <w:fldChar w:fldCharType="end"/>
+        </w:r>
+      </w:hyperlink>
+    </w:p>
+    <w:p>
+      <w:pPr>
+        <w:pStyle w:val="TDC1"/>
+        <w:tabs>
+          <w:tab w:val="right" w:leader="dot" w:pos="8494"/>
+        </w:tabs>
+        <w:rPr>
+          <w:noProof/>
+        </w:rPr>
+      </w:pPr>
+      <w:hyperlink w:anchor="_Toc179983219" w:history="1">
+        <w:r>
+          <w:rPr>
+            <w:rStyle w:val="Hipervnculo"/>
+            <w:noProof/>
+          </w:rPr>
+          <w:t>Comentarios sobre el diagrama</w:t>
+        </w:r>
+        <w:r>
+          <w:rPr>
+            <w:noProof/>
+            <w:webHidden/>
+          </w:rPr>
+          <w:tab/>
+        </w:r>
+        <w:r>
+          <w:rPr>
+            <w:noProof/>
+            <w:webHidden/>
+          </w:rPr>
+          <w:fldChar w:fldCharType="begin"/>
+        </w:r>
+        <w:r>
+          <w:rPr>
+            <w:noProof/>
+            <w:webHidden/>
+          </w:rPr>
+          <w:instrText xml:space="preserve"> PAGEREF _Toc179983219 \h </w:instrText>
+        </w:r>
+        <w:r>
+          <w:rPr>
+            <w:noProof/>
+            <w:webHidden/>
+          </w:rPr>
+        </w:r>
+        <w:r>
+          <w:rPr>
+            <w:noProof/>
+            <w:webHidden/>
+          </w:rPr>
+          <w:fldChar w:fldCharType="separate"/>
+        </w:r>
+        <w:r>
+          <w:rPr>
+            <w:noProof/>
+            <w:webHidden/>
+          </w:rPr>
+          <w:t>8</w:t>
+        </w:r>
+        <w:r>
+          <w:rPr>
+            <w:noProof/>
+            <w:webHidden/>
+          </w:rPr>
+          <w:fldChar w:fldCharType="end"/>
+        </w:r>
+      </w:hyperlink>
+    </w:p>
+    <w:p>
+      <w:pPr>
         <w:ind w:left="708" w:hanging="708"/>
         <w:rPr>
           <w:sz w:val="24"/>
           <w:szCs w:val="24"/>
         </w:rPr>
       </w:pPr>
+      <w:r>
+        <w:rPr>
+          <w:sz w:val="24"/>
+          <w:szCs w:val="24"/>
+        </w:rPr>
+        <w:fldChar w:fldCharType="end"/>
+      </w:r>
     </w:p>
     <w:p>
       <w:pPr>
@@ -574,45 +945,26 @@
     </w:p>
     <w:p>
       <w:pPr>
-        <w:ind w:left="708" w:hanging="708"/>
-        <w:rPr>
-          <w:sz w:val="24"/>
-          <w:szCs w:val="24"/>
-        </w:rPr>
-      </w:pPr>
-    </w:p>
-    <w:p>
-      <w:pPr>
-        <w:ind w:left="708" w:hanging="708"/>
-        <w:rPr>
-          <w:sz w:val="24"/>
-          <w:szCs w:val="24"/>
-        </w:rPr>
-      </w:pPr>
-    </w:p>
-    <w:p>
-      <w:pPr>
-        <w:ind w:left="708" w:hanging="708"/>
-        <w:rPr>
-          <w:sz w:val="24"/>
-          <w:szCs w:val="24"/>
-        </w:rPr>
-      </w:pPr>
-    </w:p>
-    <w:p>
-      <w:pPr>
-        <w:ind w:left="708" w:hanging="708"/>
-        <w:rPr>
-          <w:sz w:val="24"/>
-          <w:szCs w:val="24"/>
-        </w:rPr>
-      </w:pPr>
+        <w:rPr>
+          <w:rFonts w:ascii="Arial Black" w:eastAsiaTheme="majorEastAsia" w:hAnsi="Arial Black" w:cstheme="majorBidi"/>
+          <w:sz w:val="32"/>
+          <w:szCs w:val="40"/>
+        </w:rPr>
+      </w:pPr>
+      <w:bookmarkStart w:id="0" w:name="_Toc179983215"/>
+      <w:r>
+        <w:br w:type="page"/>
+      </w:r>
     </w:p>
     <w:p>
       <w:pPr>
         <w:pStyle w:val="Ttulo1"/>
       </w:pPr>
       <w:r>
+        <w:rPr>
+          <w:noProof/>
+          <w:lang w:eastAsia="es-ES"/>
+        </w:rPr>
         <w:lastRenderedPageBreak/>
         <w:drawing>
           <wp:anchor distT="0" distB="0" distL="114300" distR="114300" simplePos="0" relativeHeight="251658240" behindDoc="1" locked="0" layoutInCell="1" allowOverlap="1" wp14:anchorId="4A3E992A" wp14:editId="0D4ABC92">
@@ -638,7 +990,7 @@
                     <pic:cNvPicPr/>
                   </pic:nvPicPr>
                   <pic:blipFill>
-                    <a:blip r:embed="rId5">
+                    <a:blip r:embed="rId6">
                       <a:extLst>
                         <a:ext uri="{28A0092B-C50C-407E-A947-70E740481C1C}">
                           <a14:useLocalDpi xmlns:a14="http://schemas.microsoft.com/office/drawing/2010/main" val="0"/>
@@ -684,6 +1036,7 @@
       <w:r>
         <w:t>Mapping</w:t>
       </w:r>
+      <w:bookmarkEnd w:id="0"/>
       <w:proofErr w:type="spellEnd"/>
     </w:p>
     <w:p>
@@ -718,8 +1071,12 @@
     <w:p/>
     <w:p/>
     <w:p/>
-    <w:p/>
-    <w:p/>
+    <w:p>
+      <w:bookmarkStart w:id="1" w:name="_Toc179983216"/>
+      <w:r>
+        <w:br w:type="page"/>
+      </w:r>
+    </w:p>
     <w:p>
       <w:pPr>
         <w:pStyle w:val="Ttulo1"/>
@@ -728,6 +1085,7 @@
         <w:lastRenderedPageBreak/>
         <w:t>Historias de usuario</w:t>
       </w:r>
+      <w:bookmarkEnd w:id="1"/>
     </w:p>
     <w:p>
       <w:pPr>
@@ -988,15 +1346,7 @@
         <w:t>cuando</w:t>
       </w:r>
       <w:r>
-        <w:t xml:space="preserve"> intenta </w:t>
-      </w:r>
-      <w:proofErr w:type="spellStart"/>
-      <w:r>
-        <w:t>logearse</w:t>
-      </w:r>
-      <w:proofErr w:type="spellEnd"/>
-      <w:r>
-        <w:t>,</w:t>
+        <w:t xml:space="preserve"> intenta logearse,</w:t>
       </w:r>
     </w:p>
     <w:p>
@@ -1461,6 +1811,21 @@
     </w:p>
     <w:p>
       <w:pPr>
+        <w:rPr>
+          <w:b/>
+          <w:bCs/>
+        </w:rPr>
+      </w:pPr>
+      <w:r>
+        <w:rPr>
+          <w:b/>
+          <w:bCs/>
+        </w:rPr>
+        <w:br w:type="page"/>
+      </w:r>
+    </w:p>
+    <w:p>
+      <w:pPr>
         <w:jc w:val="both"/>
       </w:pPr>
       <w:r>
@@ -2095,6 +2460,21 @@
     </w:p>
     <w:p>
       <w:pPr>
+        <w:rPr>
+          <w:b/>
+          <w:bCs/>
+        </w:rPr>
+      </w:pPr>
+      <w:r>
+        <w:rPr>
+          <w:b/>
+          <w:bCs/>
+        </w:rPr>
+        <w:br w:type="page"/>
+      </w:r>
+    </w:p>
+    <w:p>
+      <w:pPr>
         <w:jc w:val="both"/>
       </w:pPr>
       <w:r>
@@ -2523,9 +2903,11 @@
       <w:pPr>
         <w:pStyle w:val="Ttulo1"/>
       </w:pPr>
+      <w:bookmarkStart w:id="2" w:name="_Toc179983217"/>
       <w:r>
         <w:t>Requisitos NO funcionales</w:t>
       </w:r>
+      <w:bookmarkEnd w:id="2"/>
     </w:p>
     <w:p>
       <w:pPr>
@@ -2687,8 +3069,6 @@
         <w:t xml:space="preserve"> Intercambio seguro de mensajes entre usuarios.</w:t>
       </w:r>
     </w:p>
-    <w:p/>
-    <w:p/>
     <w:p/>
     <w:p/>
     <w:p/>
@@ -2708,16 +3088,22 @@
       <w:pPr>
         <w:pStyle w:val="Ttulo1"/>
       </w:pPr>
+      <w:bookmarkStart w:id="3" w:name="_Toc179983218"/>
       <w:r>
         <w:lastRenderedPageBreak/>
         <w:t>Diagrama de clases (UML)</w:t>
       </w:r>
+      <w:bookmarkEnd w:id="3"/>
     </w:p>
     <w:p>
       <w:pPr>
         <w:jc w:val="center"/>
       </w:pPr>
       <w:r>
+        <w:rPr>
+          <w:noProof/>
+          <w:lang w:eastAsia="es-ES"/>
+        </w:rPr>
         <w:drawing>
           <wp:inline distT="0" distB="0" distL="0" distR="0" wp14:anchorId="456E59C3" wp14:editId="0863B0BD">
             <wp:extent cx="7405255" cy="5272674"/>
@@ -2734,7 +3120,7 @@
                     <pic:cNvPicPr/>
                   </pic:nvPicPr>
                   <pic:blipFill>
-                    <a:blip r:embed="rId6"/>
+                    <a:blip r:embed="rId7"/>
                     <a:stretch>
                       <a:fillRect/>
                     </a:stretch>
@@ -2770,10 +3156,12 @@
       <w:pPr>
         <w:pStyle w:val="Ttulo1"/>
       </w:pPr>
+      <w:bookmarkStart w:id="4" w:name="_Toc179983219"/>
       <w:r>
         <w:lastRenderedPageBreak/>
         <w:t>Comentarios sobre el diagrama</w:t>
       </w:r>
+      <w:bookmarkEnd w:id="4"/>
     </w:p>
     <w:p>
       <w:pPr>
@@ -2782,32 +3170,280 @@
           <w:ilvl w:val="0"/>
           <w:numId w:val="7"/>
         </w:numPr>
-      </w:pPr>
-      <w:r>
+        <w:jc w:val="both"/>
+      </w:pPr>
+      <w:r>
+        <w:rPr>
+          <w:u w:val="single"/>
+        </w:rPr>
         <w:t xml:space="preserve">Clase </w:t>
       </w:r>
       <w:proofErr w:type="spellStart"/>
       <w:r>
+        <w:rPr>
+          <w:u w:val="single"/>
+        </w:rPr>
         <w:t>Enviador</w:t>
       </w:r>
       <w:proofErr w:type="spellEnd"/>
       <w:r>
-        <w:t xml:space="preserve">. </w:t>
+        <w:rPr>
+          <w:u w:val="single"/>
+        </w:rPr>
+        <w:t>:</w:t>
+      </w:r>
+      <w:r>
+        <w:t xml:space="preserve"> </w:t>
       </w:r>
       <w:r>
         <w:t xml:space="preserve">Se trata de una </w:t>
       </w:r>
       <w:r>
-        <w:t xml:space="preserve">clase sería un ejemplo de clase Servicio de DDD. En este caso la operación del negocio es reproducir canciones, la cual no debe ser parte de la clase Canción sino en una clase aparte que encapsula el acceso a la librería </w:t>
+        <w:t xml:space="preserve">clase sería un ejemplo de clase Servicio de DDD. En este caso la operación del negocio es </w:t>
+      </w:r>
+      <w:r>
+        <w:t>enviar y recibir mensajes.</w:t>
+      </w:r>
+      <w:r>
+        <w:t xml:space="preserve"> </w:t>
+      </w:r>
+    </w:p>
+    <w:p>
+      <w:pPr>
+        <w:pStyle w:val="Prrafodelista"/>
+      </w:pPr>
+    </w:p>
+    <w:p>
+      <w:pPr>
+        <w:pStyle w:val="Prrafodelista"/>
+        <w:jc w:val="center"/>
+      </w:pPr>
+      <w:r>
+        <w:drawing>
+          <wp:inline distT="0" distB="0" distL="0" distR="0" wp14:anchorId="6D9F89FD" wp14:editId="68774E21">
+            <wp:extent cx="3533775" cy="2052336"/>
+            <wp:effectExtent l="0" t="0" r="0" b="5080"/>
+            <wp:docPr id="1" name="Imagen 1"/>
+            <wp:cNvGraphicFramePr>
+              <a:graphicFrameLocks xmlns:a="http://schemas.openxmlformats.org/drawingml/2006/main" noChangeAspect="1"/>
+            </wp:cNvGraphicFramePr>
+            <a:graphic xmlns:a="http://schemas.openxmlformats.org/drawingml/2006/main">
+              <a:graphicData uri="http://schemas.openxmlformats.org/drawingml/2006/picture">
+                <pic:pic xmlns:pic="http://schemas.openxmlformats.org/drawingml/2006/picture">
+                  <pic:nvPicPr>
+                    <pic:cNvPr id="1" name=""/>
+                    <pic:cNvPicPr/>
+                  </pic:nvPicPr>
+                  <pic:blipFill rotWithShape="1">
+                    <a:blip r:embed="rId8"/>
+                    <a:srcRect l="9526" t="20740" r="4221" b="3741"/>
+                    <a:stretch/>
+                  </pic:blipFill>
+                  <pic:spPr bwMode="auto">
+                    <a:xfrm>
+                      <a:off x="0" y="0"/>
+                      <a:ext cx="3533775" cy="2052336"/>
+                    </a:xfrm>
+                    <a:prstGeom prst="rect">
+                      <a:avLst/>
+                    </a:prstGeom>
+                    <a:ln>
+                      <a:noFill/>
+                    </a:ln>
+                    <a:extLst>
+                      <a:ext uri="{53640926-AAD7-44D8-BBD7-CCE9431645EC}">
+                        <a14:shadowObscured xmlns:a14="http://schemas.microsoft.com/office/drawing/2010/main"/>
+                      </a:ext>
+                    </a:extLst>
+                  </pic:spPr>
+                </pic:pic>
+              </a:graphicData>
+            </a:graphic>
+          </wp:inline>
+        </w:drawing>
+      </w:r>
+    </w:p>
+    <w:p>
+      <w:pPr>
+        <w:pStyle w:val="Prrafodelista"/>
+      </w:pPr>
+    </w:p>
+    <w:p>
+      <w:pPr>
+        <w:pStyle w:val="Prrafodelista"/>
+        <w:numPr>
+          <w:ilvl w:val="0"/>
+          <w:numId w:val="7"/>
+        </w:numPr>
+        <w:jc w:val="both"/>
+        <w:rPr>
+          <w:rStyle w:val="fontstyle21"/>
+          <w:rFonts w:asciiTheme="minorHAnsi" w:hAnsiTheme="minorHAnsi"/>
+          <w:color w:val="auto"/>
+          <w:sz w:val="22"/>
+          <w:szCs w:val="22"/>
+        </w:rPr>
+      </w:pPr>
+      <w:r>
+        <w:rPr>
+          <w:rStyle w:val="fontstyle01"/>
+          <w:rFonts w:asciiTheme="minorHAnsi" w:hAnsiTheme="minorHAnsi"/>
+          <w:b w:val="0"/>
+          <w:u w:val="single"/>
+        </w:rPr>
+        <w:t xml:space="preserve">Clase </w:t>
       </w:r>
       <w:proofErr w:type="spellStart"/>
       <w:r>
-        <w:t>JavaFX</w:t>
+        <w:rPr>
+          <w:rStyle w:val="fontstyle01"/>
+          <w:rFonts w:asciiTheme="minorHAnsi" w:hAnsiTheme="minorHAnsi"/>
+          <w:b w:val="0"/>
+          <w:u w:val="single"/>
+        </w:rPr>
+        <w:t>CreadorPDF</w:t>
       </w:r>
       <w:proofErr w:type="spellEnd"/>
       <w:r>
+        <w:rPr>
+          <w:rStyle w:val="fontstyle01"/>
+          <w:rFonts w:asciiTheme="minorHAnsi" w:hAnsiTheme="minorHAnsi"/>
+          <w:b w:val="0"/>
+          <w:u w:val="single"/>
+        </w:rPr>
+        <w:t>:</w:t>
+      </w:r>
+      <w:r>
+        <w:rPr>
+          <w:rStyle w:val="fontstyle01"/>
+          <w:rFonts w:asciiTheme="minorHAnsi" w:hAnsiTheme="minorHAnsi"/>
+        </w:rPr>
+        <w:t xml:space="preserve"> </w:t>
+      </w:r>
+      <w:r>
+        <w:rPr>
+          <w:rStyle w:val="fontstyle21"/>
+          <w:rFonts w:asciiTheme="minorHAnsi" w:hAnsiTheme="minorHAnsi"/>
+        </w:rPr>
+        <w:t xml:space="preserve">Es otra clase Servicio encargada de crear un archivo PDF con información sobre </w:t>
+      </w:r>
+      <w:r>
+        <w:rPr>
+          <w:rStyle w:val="fontstyle21"/>
+          <w:rFonts w:asciiTheme="minorHAnsi" w:hAnsiTheme="minorHAnsi"/>
+        </w:rPr>
+        <w:t>la conversación</w:t>
+      </w:r>
+      <w:r>
+        <w:rPr>
+          <w:rStyle w:val="fontstyle21"/>
+          <w:rFonts w:asciiTheme="minorHAnsi" w:hAnsiTheme="minorHAnsi"/>
+        </w:rPr>
+        <w:t xml:space="preserve"> de un usuario</w:t>
+      </w:r>
+      <w:r>
+        <w:rPr>
+          <w:rStyle w:val="fontstyle21"/>
+          <w:rFonts w:asciiTheme="minorHAnsi" w:hAnsiTheme="minorHAnsi"/>
+        </w:rPr>
+        <w:t xml:space="preserve"> con uno de sus contactos</w:t>
+      </w:r>
+      <w:r>
+        <w:rPr>
+          <w:rStyle w:val="fontstyle21"/>
+          <w:rFonts w:asciiTheme="minorHAnsi" w:hAnsiTheme="minorHAnsi"/>
+        </w:rPr>
+        <w:t>. Encapsula el acceso al API elegida para manejar archivos PDF</w:t>
+      </w:r>
+      <w:r>
+        <w:rPr>
+          <w:rStyle w:val="fontstyle21"/>
+          <w:rFonts w:asciiTheme="minorHAnsi" w:hAnsiTheme="minorHAnsi"/>
+        </w:rPr>
         <w:t>.</w:t>
       </w:r>
+    </w:p>
+    <w:p>
+      <w:pPr>
+        <w:pStyle w:val="Prrafodelista"/>
+        <w:jc w:val="center"/>
+        <w:rPr>
+          <w:rStyle w:val="fontstyle21"/>
+          <w:rFonts w:asciiTheme="minorHAnsi" w:hAnsiTheme="minorHAnsi"/>
+          <w:color w:val="auto"/>
+          <w:sz w:val="22"/>
+          <w:szCs w:val="22"/>
+        </w:rPr>
+      </w:pPr>
+      <w:r>
+        <w:rPr>
+          <w:rStyle w:val="fontstyle21"/>
+          <w:rFonts w:asciiTheme="minorHAnsi" w:hAnsiTheme="minorHAnsi"/>
+          <w:color w:val="auto"/>
+          <w:sz w:val="22"/>
+          <w:szCs w:val="22"/>
+        </w:rPr>
+        <w:drawing>
+          <wp:inline distT="0" distB="0" distL="0" distR="0" wp14:anchorId="4F1D6D6A" wp14:editId="1B1F04EB">
+            <wp:extent cx="4200525" cy="1591991"/>
+            <wp:effectExtent l="0" t="0" r="0" b="8255"/>
+            <wp:docPr id="2" name="Imagen 2"/>
+            <wp:cNvGraphicFramePr>
+              <a:graphicFrameLocks xmlns:a="http://schemas.openxmlformats.org/drawingml/2006/main" noChangeAspect="1"/>
+            </wp:cNvGraphicFramePr>
+            <a:graphic xmlns:a="http://schemas.openxmlformats.org/drawingml/2006/main">
+              <a:graphicData uri="http://schemas.openxmlformats.org/drawingml/2006/picture">
+                <pic:pic xmlns:pic="http://schemas.openxmlformats.org/drawingml/2006/picture">
+                  <pic:nvPicPr>
+                    <pic:cNvPr id="1" name=""/>
+                    <pic:cNvPicPr/>
+                  </pic:nvPicPr>
+                  <pic:blipFill>
+                    <a:blip r:embed="rId9"/>
+                    <a:stretch>
+                      <a:fillRect/>
+                    </a:stretch>
+                  </pic:blipFill>
+                  <pic:spPr>
+                    <a:xfrm>
+                      <a:off x="0" y="0"/>
+                      <a:ext cx="4212478" cy="1596521"/>
+                    </a:xfrm>
+                    <a:prstGeom prst="rect">
+                      <a:avLst/>
+                    </a:prstGeom>
+                  </pic:spPr>
+                </pic:pic>
+              </a:graphicData>
+            </a:graphic>
+          </wp:inline>
+        </w:drawing>
+      </w:r>
+    </w:p>
+    <w:p>
+      <w:pPr>
+        <w:pStyle w:val="Prrafodelista"/>
+        <w:jc w:val="both"/>
+        <w:rPr>
+          <w:rStyle w:val="fontstyle21"/>
+          <w:rFonts w:asciiTheme="minorHAnsi" w:hAnsiTheme="minorHAnsi"/>
+          <w:color w:val="auto"/>
+          <w:sz w:val="22"/>
+          <w:szCs w:val="22"/>
+        </w:rPr>
+      </w:pPr>
+    </w:p>
+    <w:p>
+      <w:pPr>
+        <w:pStyle w:val="Prrafodelista"/>
+        <w:numPr>
+          <w:ilvl w:val="0"/>
+          <w:numId w:val="7"/>
+        </w:numPr>
+        <w:jc w:val="both"/>
+      </w:pPr>
+      <w:bookmarkStart w:id="5" w:name="_GoBack"/>
+      <w:bookmarkEnd w:id="5"/>
     </w:p>
     <w:sectPr>
       <w:pgSz w:w="11906" w:h="16838"/>
@@ -2820,7 +3456,7 @@
 </file>
 
 <file path=word/numbering.xml><?xml version="1.0" encoding="utf-8"?>
-<w:numbering xmlns:wpc="http://schemas.microsoft.com/office/word/2010/wordprocessingCanvas" xmlns:cx="http://schemas.microsoft.com/office/drawing/2014/chartex" xmlns:cx1="http://schemas.microsoft.com/office/drawing/2015/9/8/chartex" xmlns:cx2="http://schemas.microsoft.com/office/drawing/2015/10/21/chartex" xmlns:cx3="http://schemas.microsoft.com/office/drawing/2016/5/9/chartex" xmlns:cx4="http://schemas.microsoft.com/office/drawing/2016/5/10/chartex" xmlns:cx5="http://schemas.microsoft.com/office/drawing/2016/5/11/chartex" xmlns:cx6="http://schemas.microsoft.com/office/drawing/2016/5/12/chartex" xmlns:cx7="http://schemas.microsoft.com/office/drawing/2016/5/13/chartex" xmlns:cx8="http://schemas.microsoft.com/office/drawing/2016/5/14/chartex" xmlns:mc="http://schemas.openxmlformats.org/markup-compatibility/2006" xmlns:aink="http://schemas.microsoft.com/office/drawing/2016/ink" xmlns:am3d="http://schemas.microsoft.com/office/drawing/2017/model3d" xmlns:o="urn:schemas-microsoft-com:office:office" xmlns:oel="http://schemas.microsoft.com/office/2019/extlst" xmlns:r="http://schemas.openxmlformats.org/officeDocument/2006/relationships" xmlns:m="http://schemas.openxmlformats.org/officeDocument/2006/math" xmlns:v="urn:schemas-microsoft-com:vml" xmlns:wp14="http://schemas.microsoft.com/office/word/2010/wordprocessingDrawing" xmlns:wp="http://schemas.openxmlformats.org/drawingml/2006/wordprocessingDrawing" xmlns:w10="urn:schemas-microsoft-com:office:word" xmlns:w="http://schemas.openxmlformats.org/wordprocessingml/2006/main" xmlns:w14="http://schemas.microsoft.com/office/word/2010/wordml" xmlns:w15="http://schemas.microsoft.com/office/word/2012/wordml" xmlns:w16cex="http://schemas.microsoft.com/office/word/2018/wordml/cex" xmlns:w16cid="http://schemas.microsoft.com/office/word/2016/wordml/cid" xmlns:w16="http://schemas.microsoft.com/office/word/2018/wordml" xmlns:w16du="http://schemas.microsoft.com/office/word/2023/wordml/word16du" xmlns:w16sdtdh="http://schemas.microsoft.com/office/word/2020/wordml/sdtdatahash" xmlns:w16se="http://schemas.microsoft.com/office/word/2015/wordml/symex" xmlns:wpg="http://schemas.microsoft.com/office/word/2010/wordprocessingGroup" xmlns:wpi="http://schemas.microsoft.com/office/word/2010/wordprocessingInk" xmlns:wne="http://schemas.microsoft.com/office/word/2006/wordml" xmlns:wps="http://schemas.microsoft.com/office/word/2010/wordprocessingShape" mc:Ignorable="w14 w15 w16se w16cid w16 w16cex w16sdtdh w16du wp14">
+<w:numbering xmlns:wpc="http://schemas.microsoft.com/office/word/2010/wordprocessingCanvas" xmlns:cx="http://schemas.microsoft.com/office/drawing/2014/chartex" xmlns:mc="http://schemas.openxmlformats.org/markup-compatibility/2006" xmlns:o="urn:schemas-microsoft-com:office:office" xmlns:r="http://schemas.openxmlformats.org/officeDocument/2006/relationships" xmlns:m="http://schemas.openxmlformats.org/officeDocument/2006/math" xmlns:v="urn:schemas-microsoft-com:vml" xmlns:wp14="http://schemas.microsoft.com/office/word/2010/wordprocessingDrawing" xmlns:wp="http://schemas.openxmlformats.org/drawingml/2006/wordprocessingDrawing" xmlns:w10="urn:schemas-microsoft-com:office:word" xmlns:w="http://schemas.openxmlformats.org/wordprocessingml/2006/main" xmlns:w14="http://schemas.microsoft.com/office/word/2010/wordml" xmlns:w15="http://schemas.microsoft.com/office/word/2012/wordml" xmlns:w16se="http://schemas.microsoft.com/office/word/2015/wordml/symex" xmlns:wpg="http://schemas.microsoft.com/office/word/2010/wordprocessingGroup" xmlns:wpi="http://schemas.microsoft.com/office/word/2010/wordprocessingInk" xmlns:wne="http://schemas.microsoft.com/office/word/2006/wordml" xmlns:wps="http://schemas.microsoft.com/office/word/2010/wordprocessingShape" mc:Ignorable="w14 w15 w16se wp14">
   <w:abstractNum w:abstractNumId="0" w15:restartNumberingAfterBreak="0">
     <w:nsid w:val="0A440A61"/>
     <w:multiLevelType w:val="hybridMultilevel"/>
@@ -3467,32 +4103,32 @@
       </w:pPr>
     </w:lvl>
   </w:abstractNum>
-  <w:num w:numId="1" w16cid:durableId="476652254">
+  <w:num w:numId="1">
     <w:abstractNumId w:val="1"/>
   </w:num>
-  <w:num w:numId="2" w16cid:durableId="80764613">
+  <w:num w:numId="2">
     <w:abstractNumId w:val="0"/>
   </w:num>
-  <w:num w:numId="3" w16cid:durableId="516120030">
+  <w:num w:numId="3">
     <w:abstractNumId w:val="5"/>
   </w:num>
-  <w:num w:numId="4" w16cid:durableId="445587439">
+  <w:num w:numId="4">
     <w:abstractNumId w:val="3"/>
   </w:num>
-  <w:num w:numId="5" w16cid:durableId="2008745738">
+  <w:num w:numId="5">
     <w:abstractNumId w:val="4"/>
   </w:num>
-  <w:num w:numId="6" w16cid:durableId="383675617">
+  <w:num w:numId="6">
     <w:abstractNumId w:val="6"/>
   </w:num>
-  <w:num w:numId="7" w16cid:durableId="611018318">
+  <w:num w:numId="7">
     <w:abstractNumId w:val="2"/>
   </w:num>
 </w:numbering>
 </file>
 
 <file path=word/styles.xml><?xml version="1.0" encoding="utf-8"?>
-<w:styles xmlns:mc="http://schemas.openxmlformats.org/markup-compatibility/2006" xmlns:r="http://schemas.openxmlformats.org/officeDocument/2006/relationships" xmlns:w="http://schemas.openxmlformats.org/wordprocessingml/2006/main" xmlns:w14="http://schemas.microsoft.com/office/word/2010/wordml" xmlns:w15="http://schemas.microsoft.com/office/word/2012/wordml" xmlns:w16cex="http://schemas.microsoft.com/office/word/2018/wordml/cex" xmlns:w16cid="http://schemas.microsoft.com/office/word/2016/wordml/cid" xmlns:w16="http://schemas.microsoft.com/office/word/2018/wordml" xmlns:w16du="http://schemas.microsoft.com/office/word/2023/wordml/word16du" xmlns:w16sdtdh="http://schemas.microsoft.com/office/word/2020/wordml/sdtdatahash" xmlns:w16se="http://schemas.microsoft.com/office/word/2015/wordml/symex" mc:Ignorable="w14 w15 w16se w16cid w16 w16cex w16sdtdh w16du">
+<w:styles xmlns:mc="http://schemas.openxmlformats.org/markup-compatibility/2006" xmlns:r="http://schemas.openxmlformats.org/officeDocument/2006/relationships" xmlns:w="http://schemas.openxmlformats.org/wordprocessingml/2006/main" xmlns:w14="http://schemas.microsoft.com/office/word/2010/wordml" xmlns:w15="http://schemas.microsoft.com/office/word/2012/wordml" xmlns:w16se="http://schemas.microsoft.com/office/word/2015/wordml/symex" mc:Ignorable="w14 w15 w16se">
   <w:docDefaults>
     <w:rPrDefault>
       <w:rPr>
@@ -3510,7 +4146,7 @@
       </w:pPr>
     </w:pPrDefault>
   </w:docDefaults>
-  <w:latentStyles w:defLockedState="0" w:defUIPriority="99" w:defSemiHidden="0" w:defUnhideWhenUsed="0" w:defQFormat="0" w:count="376">
+  <w:latentStyles w:defLockedState="0" w:defUIPriority="99" w:defSemiHidden="0" w:defUnhideWhenUsed="0" w:defQFormat="0" w:count="371">
     <w:lsdException w:name="Normal" w:uiPriority="0" w:qFormat="1"/>
     <w:lsdException w:name="heading 1" w:uiPriority="9" w:qFormat="1"/>
     <w:lsdException w:name="heading 2" w:semiHidden="1" w:uiPriority="9" w:unhideWhenUsed="1" w:qFormat="1"/>
@@ -3882,11 +4518,6 @@
     <w:lsdException w:name="List Table 5 Dark Accent 6" w:uiPriority="50"/>
     <w:lsdException w:name="List Table 6 Colorful Accent 6" w:uiPriority="51"/>
     <w:lsdException w:name="List Table 7 Colorful Accent 6" w:uiPriority="52"/>
-    <w:lsdException w:name="Mention" w:semiHidden="1" w:unhideWhenUsed="1"/>
-    <w:lsdException w:name="Smart Hyperlink" w:semiHidden="1" w:unhideWhenUsed="1"/>
-    <w:lsdException w:name="Hashtag" w:semiHidden="1" w:unhideWhenUsed="1"/>
-    <w:lsdException w:name="Unresolved Mention" w:semiHidden="1" w:unhideWhenUsed="1"/>
-    <w:lsdException w:name="Smart Link" w:semiHidden="1" w:unhideWhenUsed="1"/>
   </w:latentStyles>
   <w:style w:type="paragraph" w:default="1" w:styleId="Normal">
     <w:name w:val="Normal"/>
@@ -4093,6 +4724,7 @@
   <w:style w:type="character" w:default="1" w:styleId="Fuentedeprrafopredeter">
     <w:name w:val="Default Paragraph Font"/>
     <w:uiPriority w:val="1"/>
+    <w:semiHidden/>
     <w:unhideWhenUsed/>
   </w:style>
   <w:style w:type="table" w:default="1" w:styleId="Tablanormal">
@@ -4405,6 +5037,59 @@
       <w:spacing w:val="5"/>
     </w:rPr>
   </w:style>
+  <w:style w:type="paragraph" w:styleId="TDC1">
+    <w:name w:val="toc 1"/>
+    <w:basedOn w:val="Normal"/>
+    <w:next w:val="Normal"/>
+    <w:autoRedefine/>
+    <w:uiPriority w:val="39"/>
+    <w:unhideWhenUsed/>
+    <w:rsid w:val="002B6518"/>
+    <w:pPr>
+      <w:spacing w:after="100"/>
+    </w:pPr>
+  </w:style>
+  <w:style w:type="character" w:styleId="Hipervnculo">
+    <w:name w:val="Hyperlink"/>
+    <w:basedOn w:val="Fuentedeprrafopredeter"/>
+    <w:uiPriority w:val="99"/>
+    <w:unhideWhenUsed/>
+    <w:rsid w:val="002B6518"/>
+    <w:rPr>
+      <w:color w:val="467886" w:themeColor="hyperlink"/>
+      <w:u w:val="single"/>
+    </w:rPr>
+  </w:style>
+  <w:style w:type="character" w:customStyle="1" w:styleId="fontstyle01">
+    <w:name w:val="fontstyle01"/>
+    <w:basedOn w:val="Fuentedeprrafopredeter"/>
+    <w:rsid w:val="000760FA"/>
+    <w:rPr>
+      <w:rFonts w:ascii="TimesNewRomanPS-BoldMT" w:hAnsi="TimesNewRomanPS-BoldMT" w:hint="default"/>
+      <w:b/>
+      <w:bCs/>
+      <w:i w:val="0"/>
+      <w:iCs w:val="0"/>
+      <w:color w:val="000000"/>
+      <w:sz w:val="24"/>
+      <w:szCs w:val="24"/>
+    </w:rPr>
+  </w:style>
+  <w:style w:type="character" w:customStyle="1" w:styleId="fontstyle21">
+    <w:name w:val="fontstyle21"/>
+    <w:basedOn w:val="Fuentedeprrafopredeter"/>
+    <w:rsid w:val="000760FA"/>
+    <w:rPr>
+      <w:rFonts w:ascii="TimesNewRomanPSMT" w:hAnsi="TimesNewRomanPSMT" w:hint="default"/>
+      <w:b w:val="0"/>
+      <w:bCs w:val="0"/>
+      <w:i w:val="0"/>
+      <w:iCs w:val="0"/>
+      <w:color w:val="000000"/>
+      <w:sz w:val="24"/>
+      <w:szCs w:val="24"/>
+    </w:rPr>
+  </w:style>
 </w:styles>
 </file>
 
@@ -4701,4 +5386,16 @@
     </a:ext>
   </a:extLst>
 </a:theme>
+</file>
+
+<file path=customXml/item1.xml><?xml version="1.0" encoding="utf-8"?>
+<b:Sources xmlns:b="http://schemas.openxmlformats.org/officeDocument/2006/bibliography" xmlns="http://schemas.openxmlformats.org/officeDocument/2006/bibliography" SelectedStyle="\APASixthEditionOfficeOnline.xsl" StyleName="APA" Version="6"/>
+</file>
+
+<file path=customXml/itemProps1.xml><?xml version="1.0" encoding="utf-8"?>
+<ds:datastoreItem xmlns:ds="http://schemas.openxmlformats.org/officeDocument/2006/customXml" ds:itemID="{0F3B11C7-FE6D-4E98-92AA-5765B831D9CE}">
+  <ds:schemaRefs>
+    <ds:schemaRef ds:uri="http://schemas.openxmlformats.org/officeDocument/2006/bibliography"/>
+  </ds:schemaRefs>
+</ds:datastoreItem>
 </file>
</xml_diff>

<commit_message>
Documento entrega opcional terminado
</commit_message>
<xml_diff>
--- a/AppChat-entrega1.docx
+++ b/AppChat-entrega1.docx
@@ -6,6 +6,14 @@
       <w:r>
         <w:t>Lucía Olmos Martínez; Grupo 2.1</w:t>
       </w:r>
+      <w:r>
+        <w:t xml:space="preserve">; GitHub: </w:t>
+      </w:r>
+      <w:proofErr w:type="spellStart"/>
+      <w:r>
+        <w:t>bluckple</w:t>
+      </w:r>
+      <w:proofErr w:type="spellEnd"/>
     </w:p>
     <w:p>
       <w:r>
@@ -13,6 +21,9 @@
       </w:r>
       <w:r>
         <w:t>a; Grupo 2.1</w:t>
+      </w:r>
+      <w:r>
+        <w:t>; GitHub: anamg23</w:t>
       </w:r>
     </w:p>
     <w:p>
@@ -26,73 +37,821 @@
     </w:p>
     <w:p>
       <w:pPr>
-        <w:jc w:val="center"/>
-        <w:rPr>
-          <w:sz w:val="40"/>
-          <w:szCs w:val="40"/>
-        </w:rPr>
-      </w:pPr>
-      <w:r>
-        <w:rPr>
-          <w:sz w:val="40"/>
-          <w:szCs w:val="40"/>
-        </w:rPr>
-        <w:t xml:space="preserve">REQUISITOS Y DIAGRAMA </w:t>
-      </w:r>
-    </w:p>
-    <w:p>
-      <w:pPr>
-        <w:jc w:val="center"/>
-        <w:rPr>
-          <w:sz w:val="40"/>
-          <w:szCs w:val="40"/>
-        </w:rPr>
-      </w:pPr>
-      <w:r>
-        <w:rPr>
-          <w:sz w:val="40"/>
-          <w:szCs w:val="40"/>
-        </w:rPr>
-        <w:t xml:space="preserve">DE CLASES DEL DOMINIO DE </w:t>
-      </w:r>
+        <w:ind w:left="708" w:hanging="708"/>
+        <w:rPr>
+          <w:sz w:val="24"/>
+          <w:szCs w:val="24"/>
+        </w:rPr>
+      </w:pPr>
+      <w:r>
+        <w:rPr>
+          <w:noProof/>
+          <w:lang w:eastAsia="es-ES"/>
+        </w:rPr>
+        <mc:AlternateContent>
+          <mc:Choice Requires="wps">
+            <w:drawing>
+              <wp:anchor distT="0" distB="0" distL="114300" distR="114300" simplePos="0" relativeHeight="251662336" behindDoc="0" locked="0" layoutInCell="1" allowOverlap="1" wp14:anchorId="145D7074" wp14:editId="5606B7AB">
+                <wp:simplePos x="0" y="0"/>
+                <wp:positionH relativeFrom="column">
+                  <wp:posOffset>0</wp:posOffset>
+                </wp:positionH>
+                <wp:positionV relativeFrom="paragraph">
+                  <wp:posOffset>0</wp:posOffset>
+                </wp:positionV>
+                <wp:extent cx="1828800" cy="1828800"/>
+                <wp:effectExtent l="0" t="0" r="0" b="0"/>
+                <wp:wrapSquare wrapText="bothSides"/>
+                <wp:docPr id="5" name="Cuadro de texto 5"/>
+                <wp:cNvGraphicFramePr/>
+                <a:graphic xmlns:a="http://schemas.openxmlformats.org/drawingml/2006/main">
+                  <a:graphicData uri="http://schemas.microsoft.com/office/word/2010/wordprocessingShape">
+                    <wps:wsp>
+                      <wps:cNvSpPr txBox="1"/>
+                      <wps:spPr>
+                        <a:xfrm>
+                          <a:off x="0" y="0"/>
+                          <a:ext cx="1828800" cy="1828800"/>
+                        </a:xfrm>
+                        <a:prstGeom prst="rect">
+                          <a:avLst/>
+                        </a:prstGeom>
+                        <a:noFill/>
+                        <a:ln>
+                          <a:noFill/>
+                        </a:ln>
+                      </wps:spPr>
+                      <wps:txbx>
+                        <w:txbxContent>
+                          <w:p>
+                            <w:pPr>
+                              <w:jc w:val="center"/>
+                              <w:rPr>
+                                <w:sz w:val="56"/>
+                                <w:szCs w:val="72"/>
+                                <w14:reflection w14:blurRad="6350" w14:stA="53000" w14:stPos="0" w14:endA="300" w14:endPos="35500" w14:dist="0" w14:dir="5400000" w14:fadeDir="5400000" w14:sx="100000" w14:sy="-90000" w14:kx="0" w14:ky="0" w14:algn="bl"/>
+                                <w14:textOutline w14:w="0" w14:cap="flat" w14:cmpd="sng" w14:algn="ctr">
+                                  <w14:noFill/>
+                                  <w14:prstDash w14:val="solid"/>
+                                  <w14:round/>
+                                </w14:textOutline>
+                                <w14:textFill>
+                                  <w14:gradFill>
+                                    <w14:gsLst>
+                                      <w14:gs w14:pos="0">
+                                        <w14:schemeClr w14:val="accent5">
+                                          <w14:lumMod w14:val="50000"/>
+                                        </w14:schemeClr>
+                                      </w14:gs>
+                                      <w14:gs w14:pos="50000">
+                                        <w14:schemeClr w14:val="accent5"/>
+                                      </w14:gs>
+                                      <w14:gs w14:pos="100000">
+                                        <w14:schemeClr w14:val="accent5">
+                                          <w14:lumMod w14:val="60000"/>
+                                          <w14:lumOff w14:val="40000"/>
+                                        </w14:schemeClr>
+                                      </w14:gs>
+                                    </w14:gsLst>
+                                    <w14:lin w14:ang="5400000" w14:scaled="0"/>
+                                  </w14:gradFill>
+                                </w14:textFill>
+                              </w:rPr>
+                            </w:pPr>
+                            <w:r>
+                              <w:rPr>
+                                <w:sz w:val="56"/>
+                                <w:szCs w:val="72"/>
+                                <w14:reflection w14:blurRad="6350" w14:stA="53000" w14:stPos="0" w14:endA="300" w14:endPos="35500" w14:dist="0" w14:dir="5400000" w14:fadeDir="5400000" w14:sx="100000" w14:sy="-90000" w14:kx="0" w14:ky="0" w14:algn="bl"/>
+                                <w14:textOutline w14:w="0" w14:cap="flat" w14:cmpd="sng" w14:algn="ctr">
+                                  <w14:noFill/>
+                                  <w14:prstDash w14:val="solid"/>
+                                  <w14:round/>
+                                </w14:textOutline>
+                                <w14:textFill>
+                                  <w14:gradFill>
+                                    <w14:gsLst>
+                                      <w14:gs w14:pos="0">
+                                        <w14:schemeClr w14:val="accent5">
+                                          <w14:lumMod w14:val="50000"/>
+                                        </w14:schemeClr>
+                                      </w14:gs>
+                                      <w14:gs w14:pos="50000">
+                                        <w14:schemeClr w14:val="accent5"/>
+                                      </w14:gs>
+                                      <w14:gs w14:pos="100000">
+                                        <w14:schemeClr w14:val="accent5">
+                                          <w14:lumMod w14:val="60000"/>
+                                          <w14:lumOff w14:val="40000"/>
+                                        </w14:schemeClr>
+                                      </w14:gs>
+                                    </w14:gsLst>
+                                    <w14:lin w14:ang="5400000" w14:scaled="0"/>
+                                  </w14:gradFill>
+                                </w14:textFill>
+                              </w:rPr>
+                              <w:t>REQUISITOS Y DIAGRAMA</w:t>
+                            </w:r>
+                          </w:p>
+                          <w:p>
+                            <w:pPr>
+                              <w:jc w:val="center"/>
+                              <w:rPr>
+                                <w:sz w:val="56"/>
+                                <w:szCs w:val="72"/>
+                                <w14:reflection w14:blurRad="6350" w14:stA="53000" w14:stPos="0" w14:endA="300" w14:endPos="35500" w14:dist="0" w14:dir="5400000" w14:fadeDir="5400000" w14:sx="100000" w14:sy="-90000" w14:kx="0" w14:ky="0" w14:algn="bl"/>
+                                <w14:textOutline w14:w="0" w14:cap="flat" w14:cmpd="sng" w14:algn="ctr">
+                                  <w14:noFill/>
+                                  <w14:prstDash w14:val="solid"/>
+                                  <w14:round/>
+                                </w14:textOutline>
+                                <w14:textFill>
+                                  <w14:gradFill>
+                                    <w14:gsLst>
+                                      <w14:gs w14:pos="0">
+                                        <w14:schemeClr w14:val="accent5">
+                                          <w14:lumMod w14:val="50000"/>
+                                        </w14:schemeClr>
+                                      </w14:gs>
+                                      <w14:gs w14:pos="50000">
+                                        <w14:schemeClr w14:val="accent5"/>
+                                      </w14:gs>
+                                      <w14:gs w14:pos="100000">
+                                        <w14:schemeClr w14:val="accent5">
+                                          <w14:lumMod w14:val="60000"/>
+                                          <w14:lumOff w14:val="40000"/>
+                                        </w14:schemeClr>
+                                      </w14:gs>
+                                    </w14:gsLst>
+                                    <w14:lin w14:ang="5400000" w14:scaled="0"/>
+                                  </w14:gradFill>
+                                </w14:textFill>
+                              </w:rPr>
+                            </w:pPr>
+                            <w:r>
+                              <w:rPr>
+                                <w:sz w:val="56"/>
+                                <w:szCs w:val="72"/>
+                                <w14:reflection w14:blurRad="6350" w14:stA="53000" w14:stPos="0" w14:endA="300" w14:endPos="35500" w14:dist="0" w14:dir="5400000" w14:fadeDir="5400000" w14:sx="100000" w14:sy="-90000" w14:kx="0" w14:ky="0" w14:algn="bl"/>
+                                <w14:textOutline w14:w="0" w14:cap="flat" w14:cmpd="sng" w14:algn="ctr">
+                                  <w14:noFill/>
+                                  <w14:prstDash w14:val="solid"/>
+                                  <w14:round/>
+                                </w14:textOutline>
+                                <w14:textFill>
+                                  <w14:gradFill>
+                                    <w14:gsLst>
+                                      <w14:gs w14:pos="0">
+                                        <w14:schemeClr w14:val="accent5">
+                                          <w14:lumMod w14:val="50000"/>
+                                        </w14:schemeClr>
+                                      </w14:gs>
+                                      <w14:gs w14:pos="50000">
+                                        <w14:schemeClr w14:val="accent5"/>
+                                      </w14:gs>
+                                      <w14:gs w14:pos="100000">
+                                        <w14:schemeClr w14:val="accent5">
+                                          <w14:lumMod w14:val="60000"/>
+                                          <w14:lumOff w14:val="40000"/>
+                                        </w14:schemeClr>
+                                      </w14:gs>
+                                    </w14:gsLst>
+                                    <w14:lin w14:ang="5400000" w14:scaled="0"/>
+                                  </w14:gradFill>
+                                </w14:textFill>
+                              </w:rPr>
+                              <w:t>DE CLASES DEL DOMINIO DE</w:t>
+                            </w:r>
+                          </w:p>
+                          <w:p>
+                            <w:pPr>
+                              <w:tabs>
+                                <w:tab w:val="left" w:pos="1740"/>
+                                <w:tab w:val="center" w:pos="4252"/>
+                              </w:tabs>
+                              <w:ind w:left="708" w:hanging="708"/>
+                              <w:jc w:val="center"/>
+                              <w:rPr>
+                                <w:sz w:val="72"/>
+                                <w:szCs w:val="72"/>
+                                <w14:reflection w14:blurRad="6350" w14:stA="53000" w14:stPos="0" w14:endA="300" w14:endPos="35500" w14:dist="0" w14:dir="5400000" w14:fadeDir="5400000" w14:sx="100000" w14:sy="-90000" w14:kx="0" w14:ky="0" w14:algn="bl"/>
+                                <w14:textOutline w14:w="0" w14:cap="flat" w14:cmpd="sng" w14:algn="ctr">
+                                  <w14:noFill/>
+                                  <w14:prstDash w14:val="solid"/>
+                                  <w14:round/>
+                                </w14:textOutline>
+                                <w14:textFill>
+                                  <w14:gradFill>
+                                    <w14:gsLst>
+                                      <w14:gs w14:pos="0">
+                                        <w14:schemeClr w14:val="accent5">
+                                          <w14:lumMod w14:val="50000"/>
+                                        </w14:schemeClr>
+                                      </w14:gs>
+                                      <w14:gs w14:pos="50000">
+                                        <w14:schemeClr w14:val="accent5"/>
+                                      </w14:gs>
+                                      <w14:gs w14:pos="100000">
+                                        <w14:schemeClr w14:val="accent5">
+                                          <w14:lumMod w14:val="60000"/>
+                                          <w14:lumOff w14:val="40000"/>
+                                        </w14:schemeClr>
+                                      </w14:gs>
+                                    </w14:gsLst>
+                                    <w14:lin w14:ang="5400000" w14:scaled="0"/>
+                                  </w14:gradFill>
+                                </w14:textFill>
+                              </w:rPr>
+                            </w:pPr>
+                            <w:r>
+                              <w:rPr>
+                                <w:sz w:val="56"/>
+                                <w:szCs w:val="72"/>
+                                <w14:reflection w14:blurRad="6350" w14:stA="53000" w14:stPos="0" w14:endA="300" w14:endPos="35500" w14:dist="0" w14:dir="5400000" w14:fadeDir="5400000" w14:sx="100000" w14:sy="-90000" w14:kx="0" w14:ky="0" w14:algn="bl"/>
+                                <w14:textOutline w14:w="0" w14:cap="flat" w14:cmpd="sng" w14:algn="ctr">
+                                  <w14:noFill/>
+                                  <w14:prstDash w14:val="solid"/>
+                                  <w14:round/>
+                                </w14:textOutline>
+                                <w14:textFill>
+                                  <w14:gradFill>
+                                    <w14:gsLst>
+                                      <w14:gs w14:pos="0">
+                                        <w14:schemeClr w14:val="accent5">
+                                          <w14:lumMod w14:val="50000"/>
+                                        </w14:schemeClr>
+                                      </w14:gs>
+                                      <w14:gs w14:pos="50000">
+                                        <w14:schemeClr w14:val="accent5"/>
+                                      </w14:gs>
+                                      <w14:gs w14:pos="100000">
+                                        <w14:schemeClr w14:val="accent5">
+                                          <w14:lumMod w14:val="60000"/>
+                                          <w14:lumOff w14:val="40000"/>
+                                        </w14:schemeClr>
+                                      </w14:gs>
+                                    </w14:gsLst>
+                                    <w14:lin w14:ang="5400000" w14:scaled="0"/>
+                                  </w14:gradFill>
+                                </w14:textFill>
+                              </w:rPr>
+                              <w:t>“</w:t>
+                            </w:r>
+                            <w:proofErr w:type="spellStart"/>
+                            <w:r>
+                              <w:rPr>
+                                <w:sz w:val="56"/>
+                                <w:szCs w:val="72"/>
+                                <w14:reflection w14:blurRad="6350" w14:stA="53000" w14:stPos="0" w14:endA="300" w14:endPos="35500" w14:dist="0" w14:dir="5400000" w14:fadeDir="5400000" w14:sx="100000" w14:sy="-90000" w14:kx="0" w14:ky="0" w14:algn="bl"/>
+                                <w14:textOutline w14:w="0" w14:cap="flat" w14:cmpd="sng" w14:algn="ctr">
+                                  <w14:noFill/>
+                                  <w14:prstDash w14:val="solid"/>
+                                  <w14:round/>
+                                </w14:textOutline>
+                                <w14:textFill>
+                                  <w14:gradFill>
+                                    <w14:gsLst>
+                                      <w14:gs w14:pos="0">
+                                        <w14:schemeClr w14:val="accent5">
+                                          <w14:lumMod w14:val="50000"/>
+                                        </w14:schemeClr>
+                                      </w14:gs>
+                                      <w14:gs w14:pos="50000">
+                                        <w14:schemeClr w14:val="accent5"/>
+                                      </w14:gs>
+                                      <w14:gs w14:pos="100000">
+                                        <w14:schemeClr w14:val="accent5">
+                                          <w14:lumMod w14:val="60000"/>
+                                          <w14:lumOff w14:val="40000"/>
+                                        </w14:schemeClr>
+                                      </w14:gs>
+                                    </w14:gsLst>
+                                    <w14:lin w14:ang="5400000" w14:scaled="0"/>
+                                  </w14:gradFill>
+                                </w14:textFill>
+                              </w:rPr>
+                              <w:t>AppChat</w:t>
+                            </w:r>
+                            <w:proofErr w:type="spellEnd"/>
+                            <w:r>
+                              <w:rPr>
+                                <w:sz w:val="56"/>
+                                <w:szCs w:val="72"/>
+                                <w14:reflection w14:blurRad="6350" w14:stA="53000" w14:stPos="0" w14:endA="300" w14:endPos="35500" w14:dist="0" w14:dir="5400000" w14:fadeDir="5400000" w14:sx="100000" w14:sy="-90000" w14:kx="0" w14:ky="0" w14:algn="bl"/>
+                                <w14:textOutline w14:w="0" w14:cap="flat" w14:cmpd="sng" w14:algn="ctr">
+                                  <w14:noFill/>
+                                  <w14:prstDash w14:val="solid"/>
+                                  <w14:round/>
+                                </w14:textOutline>
+                                <w14:textFill>
+                                  <w14:gradFill>
+                                    <w14:gsLst>
+                                      <w14:gs w14:pos="0">
+                                        <w14:schemeClr w14:val="accent5">
+                                          <w14:lumMod w14:val="50000"/>
+                                        </w14:schemeClr>
+                                      </w14:gs>
+                                      <w14:gs w14:pos="50000">
+                                        <w14:schemeClr w14:val="accent5"/>
+                                      </w14:gs>
+                                      <w14:gs w14:pos="100000">
+                                        <w14:schemeClr w14:val="accent5">
+                                          <w14:lumMod w14:val="60000"/>
+                                          <w14:lumOff w14:val="40000"/>
+                                        </w14:schemeClr>
+                                      </w14:gs>
+                                    </w14:gsLst>
+                                    <w14:lin w14:ang="5400000" w14:scaled="0"/>
+                                  </w14:gradFill>
+                                </w14:textFill>
+                              </w:rPr>
+                              <w:t>”</w:t>
+                            </w:r>
+                          </w:p>
+                        </w:txbxContent>
+                      </wps:txbx>
+                      <wps:bodyPr rot="0" spcFirstLastPara="0" vertOverflow="overflow" horzOverflow="overflow" vert="horz" wrap="none" lIns="91440" tIns="45720" rIns="91440" bIns="45720" numCol="1" spcCol="0" rtlCol="0" fromWordArt="0" anchor="t" anchorCtr="0" forceAA="0" compatLnSpc="1">
+                        <a:prstTxWarp prst="textNoShape">
+                          <a:avLst/>
+                        </a:prstTxWarp>
+                        <a:spAutoFit/>
+                      </wps:bodyPr>
+                    </wps:wsp>
+                  </a:graphicData>
+                </a:graphic>
+              </wp:anchor>
+            </w:drawing>
+          </mc:Choice>
+          <mc:Fallback>
+            <w:pict>
+              <v:shapetype w14:anchorId="145D7074" id="_x0000_t202" coordsize="21600,21600" o:spt="202" path="m,l,21600r21600,l21600,xe">
+                <v:stroke joinstyle="miter"/>
+                <v:path gradientshapeok="t" o:connecttype="rect"/>
+              </v:shapetype>
+              <v:shape id="Cuadro de texto 5" o:spid="_x0000_s1026" type="#_x0000_t202" style="position:absolute;left:0;text-align:left;margin-left:0;margin-top:0;width:2in;height:2in;z-index:251662336;visibility:visible;mso-wrap-style:none;mso-wrap-distance-left:9pt;mso-wrap-distance-top:0;mso-wrap-distance-right:9pt;mso-wrap-distance-bottom:0;mso-position-horizontal:absolute;mso-position-horizontal-relative:text;mso-position-vertical:absolute;mso-position-vertical-relative:text;v-text-anchor:top" o:gfxdata="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" filled="f" stroked="f">
+                <v:fill o:detectmouseclick="t"/>
+                <v:textbox style="mso-fit-shape-to-text:t">
+                  <w:txbxContent>
+                    <w:p>
+                      <w:pPr>
+                        <w:jc w:val="center"/>
+                        <w:rPr>
+                          <w:sz w:val="56"/>
+                          <w:szCs w:val="72"/>
+                          <w14:reflection w14:blurRad="6350" w14:stA="53000" w14:stPos="0" w14:endA="300" w14:endPos="35500" w14:dist="0" w14:dir="5400000" w14:fadeDir="5400000" w14:sx="100000" w14:sy="-90000" w14:kx="0" w14:ky="0" w14:algn="bl"/>
+                          <w14:textOutline w14:w="0" w14:cap="flat" w14:cmpd="sng" w14:algn="ctr">
+                            <w14:noFill/>
+                            <w14:prstDash w14:val="solid"/>
+                            <w14:round/>
+                          </w14:textOutline>
+                          <w14:textFill>
+                            <w14:gradFill>
+                              <w14:gsLst>
+                                <w14:gs w14:pos="0">
+                                  <w14:schemeClr w14:val="accent5">
+                                    <w14:lumMod w14:val="50000"/>
+                                  </w14:schemeClr>
+                                </w14:gs>
+                                <w14:gs w14:pos="50000">
+                                  <w14:schemeClr w14:val="accent5"/>
+                                </w14:gs>
+                                <w14:gs w14:pos="100000">
+                                  <w14:schemeClr w14:val="accent5">
+                                    <w14:lumMod w14:val="60000"/>
+                                    <w14:lumOff w14:val="40000"/>
+                                  </w14:schemeClr>
+                                </w14:gs>
+                              </w14:gsLst>
+                              <w14:lin w14:ang="5400000" w14:scaled="0"/>
+                            </w14:gradFill>
+                          </w14:textFill>
+                        </w:rPr>
+                      </w:pPr>
+                      <w:r>
+                        <w:rPr>
+                          <w:sz w:val="56"/>
+                          <w:szCs w:val="72"/>
+                          <w14:reflection w14:blurRad="6350" w14:stA="53000" w14:stPos="0" w14:endA="300" w14:endPos="35500" w14:dist="0" w14:dir="5400000" w14:fadeDir="5400000" w14:sx="100000" w14:sy="-90000" w14:kx="0" w14:ky="0" w14:algn="bl"/>
+                          <w14:textOutline w14:w="0" w14:cap="flat" w14:cmpd="sng" w14:algn="ctr">
+                            <w14:noFill/>
+                            <w14:prstDash w14:val="solid"/>
+                            <w14:round/>
+                          </w14:textOutline>
+                          <w14:textFill>
+                            <w14:gradFill>
+                              <w14:gsLst>
+                                <w14:gs w14:pos="0">
+                                  <w14:schemeClr w14:val="accent5">
+                                    <w14:lumMod w14:val="50000"/>
+                                  </w14:schemeClr>
+                                </w14:gs>
+                                <w14:gs w14:pos="50000">
+                                  <w14:schemeClr w14:val="accent5"/>
+                                </w14:gs>
+                                <w14:gs w14:pos="100000">
+                                  <w14:schemeClr w14:val="accent5">
+                                    <w14:lumMod w14:val="60000"/>
+                                    <w14:lumOff w14:val="40000"/>
+                                  </w14:schemeClr>
+                                </w14:gs>
+                              </w14:gsLst>
+                              <w14:lin w14:ang="5400000" w14:scaled="0"/>
+                            </w14:gradFill>
+                          </w14:textFill>
+                        </w:rPr>
+                        <w:t>REQUISITOS Y DIAGRAMA</w:t>
+                      </w:r>
+                    </w:p>
+                    <w:p>
+                      <w:pPr>
+                        <w:jc w:val="center"/>
+                        <w:rPr>
+                          <w:sz w:val="56"/>
+                          <w:szCs w:val="72"/>
+                          <w14:reflection w14:blurRad="6350" w14:stA="53000" w14:stPos="0" w14:endA="300" w14:endPos="35500" w14:dist="0" w14:dir="5400000" w14:fadeDir="5400000" w14:sx="100000" w14:sy="-90000" w14:kx="0" w14:ky="0" w14:algn="bl"/>
+                          <w14:textOutline w14:w="0" w14:cap="flat" w14:cmpd="sng" w14:algn="ctr">
+                            <w14:noFill/>
+                            <w14:prstDash w14:val="solid"/>
+                            <w14:round/>
+                          </w14:textOutline>
+                          <w14:textFill>
+                            <w14:gradFill>
+                              <w14:gsLst>
+                                <w14:gs w14:pos="0">
+                                  <w14:schemeClr w14:val="accent5">
+                                    <w14:lumMod w14:val="50000"/>
+                                  </w14:schemeClr>
+                                </w14:gs>
+                                <w14:gs w14:pos="50000">
+                                  <w14:schemeClr w14:val="accent5"/>
+                                </w14:gs>
+                                <w14:gs w14:pos="100000">
+                                  <w14:schemeClr w14:val="accent5">
+                                    <w14:lumMod w14:val="60000"/>
+                                    <w14:lumOff w14:val="40000"/>
+                                  </w14:schemeClr>
+                                </w14:gs>
+                              </w14:gsLst>
+                              <w14:lin w14:ang="5400000" w14:scaled="0"/>
+                            </w14:gradFill>
+                          </w14:textFill>
+                        </w:rPr>
+                      </w:pPr>
+                      <w:r>
+                        <w:rPr>
+                          <w:sz w:val="56"/>
+                          <w:szCs w:val="72"/>
+                          <w14:reflection w14:blurRad="6350" w14:stA="53000" w14:stPos="0" w14:endA="300" w14:endPos="35500" w14:dist="0" w14:dir="5400000" w14:fadeDir="5400000" w14:sx="100000" w14:sy="-90000" w14:kx="0" w14:ky="0" w14:algn="bl"/>
+                          <w14:textOutline w14:w="0" w14:cap="flat" w14:cmpd="sng" w14:algn="ctr">
+                            <w14:noFill/>
+                            <w14:prstDash w14:val="solid"/>
+                            <w14:round/>
+                          </w14:textOutline>
+                          <w14:textFill>
+                            <w14:gradFill>
+                              <w14:gsLst>
+                                <w14:gs w14:pos="0">
+                                  <w14:schemeClr w14:val="accent5">
+                                    <w14:lumMod w14:val="50000"/>
+                                  </w14:schemeClr>
+                                </w14:gs>
+                                <w14:gs w14:pos="50000">
+                                  <w14:schemeClr w14:val="accent5"/>
+                                </w14:gs>
+                                <w14:gs w14:pos="100000">
+                                  <w14:schemeClr w14:val="accent5">
+                                    <w14:lumMod w14:val="60000"/>
+                                    <w14:lumOff w14:val="40000"/>
+                                  </w14:schemeClr>
+                                </w14:gs>
+                              </w14:gsLst>
+                              <w14:lin w14:ang="5400000" w14:scaled="0"/>
+                            </w14:gradFill>
+                          </w14:textFill>
+                        </w:rPr>
+                        <w:t>DE CLASES DEL DOMINIO DE</w:t>
+                      </w:r>
+                    </w:p>
+                    <w:p>
+                      <w:pPr>
+                        <w:tabs>
+                          <w:tab w:val="left" w:pos="1740"/>
+                          <w:tab w:val="center" w:pos="4252"/>
+                        </w:tabs>
+                        <w:ind w:left="708" w:hanging="708"/>
+                        <w:jc w:val="center"/>
+                        <w:rPr>
+                          <w:sz w:val="72"/>
+                          <w:szCs w:val="72"/>
+                          <w14:reflection w14:blurRad="6350" w14:stA="53000" w14:stPos="0" w14:endA="300" w14:endPos="35500" w14:dist="0" w14:dir="5400000" w14:fadeDir="5400000" w14:sx="100000" w14:sy="-90000" w14:kx="0" w14:ky="0" w14:algn="bl"/>
+                          <w14:textOutline w14:w="0" w14:cap="flat" w14:cmpd="sng" w14:algn="ctr">
+                            <w14:noFill/>
+                            <w14:prstDash w14:val="solid"/>
+                            <w14:round/>
+                          </w14:textOutline>
+                          <w14:textFill>
+                            <w14:gradFill>
+                              <w14:gsLst>
+                                <w14:gs w14:pos="0">
+                                  <w14:schemeClr w14:val="accent5">
+                                    <w14:lumMod w14:val="50000"/>
+                                  </w14:schemeClr>
+                                </w14:gs>
+                                <w14:gs w14:pos="50000">
+                                  <w14:schemeClr w14:val="accent5"/>
+                                </w14:gs>
+                                <w14:gs w14:pos="100000">
+                                  <w14:schemeClr w14:val="accent5">
+                                    <w14:lumMod w14:val="60000"/>
+                                    <w14:lumOff w14:val="40000"/>
+                                  </w14:schemeClr>
+                                </w14:gs>
+                              </w14:gsLst>
+                              <w14:lin w14:ang="5400000" w14:scaled="0"/>
+                            </w14:gradFill>
+                          </w14:textFill>
+                        </w:rPr>
+                      </w:pPr>
+                      <w:r>
+                        <w:rPr>
+                          <w:sz w:val="56"/>
+                          <w:szCs w:val="72"/>
+                          <w14:reflection w14:blurRad="6350" w14:stA="53000" w14:stPos="0" w14:endA="300" w14:endPos="35500" w14:dist="0" w14:dir="5400000" w14:fadeDir="5400000" w14:sx="100000" w14:sy="-90000" w14:kx="0" w14:ky="0" w14:algn="bl"/>
+                          <w14:textOutline w14:w="0" w14:cap="flat" w14:cmpd="sng" w14:algn="ctr">
+                            <w14:noFill/>
+                            <w14:prstDash w14:val="solid"/>
+                            <w14:round/>
+                          </w14:textOutline>
+                          <w14:textFill>
+                            <w14:gradFill>
+                              <w14:gsLst>
+                                <w14:gs w14:pos="0">
+                                  <w14:schemeClr w14:val="accent5">
+                                    <w14:lumMod w14:val="50000"/>
+                                  </w14:schemeClr>
+                                </w14:gs>
+                                <w14:gs w14:pos="50000">
+                                  <w14:schemeClr w14:val="accent5"/>
+                                </w14:gs>
+                                <w14:gs w14:pos="100000">
+                                  <w14:schemeClr w14:val="accent5">
+                                    <w14:lumMod w14:val="60000"/>
+                                    <w14:lumOff w14:val="40000"/>
+                                  </w14:schemeClr>
+                                </w14:gs>
+                              </w14:gsLst>
+                              <w14:lin w14:ang="5400000" w14:scaled="0"/>
+                            </w14:gradFill>
+                          </w14:textFill>
+                        </w:rPr>
+                        <w:t>“</w:t>
+                      </w:r>
+                      <w:proofErr w:type="spellStart"/>
+                      <w:r>
+                        <w:rPr>
+                          <w:sz w:val="56"/>
+                          <w:szCs w:val="72"/>
+                          <w14:reflection w14:blurRad="6350" w14:stA="53000" w14:stPos="0" w14:endA="300" w14:endPos="35500" w14:dist="0" w14:dir="5400000" w14:fadeDir="5400000" w14:sx="100000" w14:sy="-90000" w14:kx="0" w14:ky="0" w14:algn="bl"/>
+                          <w14:textOutline w14:w="0" w14:cap="flat" w14:cmpd="sng" w14:algn="ctr">
+                            <w14:noFill/>
+                            <w14:prstDash w14:val="solid"/>
+                            <w14:round/>
+                          </w14:textOutline>
+                          <w14:textFill>
+                            <w14:gradFill>
+                              <w14:gsLst>
+                                <w14:gs w14:pos="0">
+                                  <w14:schemeClr w14:val="accent5">
+                                    <w14:lumMod w14:val="50000"/>
+                                  </w14:schemeClr>
+                                </w14:gs>
+                                <w14:gs w14:pos="50000">
+                                  <w14:schemeClr w14:val="accent5"/>
+                                </w14:gs>
+                                <w14:gs w14:pos="100000">
+                                  <w14:schemeClr w14:val="accent5">
+                                    <w14:lumMod w14:val="60000"/>
+                                    <w14:lumOff w14:val="40000"/>
+                                  </w14:schemeClr>
+                                </w14:gs>
+                              </w14:gsLst>
+                              <w14:lin w14:ang="5400000" w14:scaled="0"/>
+                            </w14:gradFill>
+                          </w14:textFill>
+                        </w:rPr>
+                        <w:t>AppChat</w:t>
+                      </w:r>
+                      <w:proofErr w:type="spellEnd"/>
+                      <w:r>
+                        <w:rPr>
+                          <w:sz w:val="56"/>
+                          <w:szCs w:val="72"/>
+                          <w14:reflection w14:blurRad="6350" w14:stA="53000" w14:stPos="0" w14:endA="300" w14:endPos="35500" w14:dist="0" w14:dir="5400000" w14:fadeDir="5400000" w14:sx="100000" w14:sy="-90000" w14:kx="0" w14:ky="0" w14:algn="bl"/>
+                          <w14:textOutline w14:w="0" w14:cap="flat" w14:cmpd="sng" w14:algn="ctr">
+                            <w14:noFill/>
+                            <w14:prstDash w14:val="solid"/>
+                            <w14:round/>
+                          </w14:textOutline>
+                          <w14:textFill>
+                            <w14:gradFill>
+                              <w14:gsLst>
+                                <w14:gs w14:pos="0">
+                                  <w14:schemeClr w14:val="accent5">
+                                    <w14:lumMod w14:val="50000"/>
+                                  </w14:schemeClr>
+                                </w14:gs>
+                                <w14:gs w14:pos="50000">
+                                  <w14:schemeClr w14:val="accent5"/>
+                                </w14:gs>
+                                <w14:gs w14:pos="100000">
+                                  <w14:schemeClr w14:val="accent5">
+                                    <w14:lumMod w14:val="60000"/>
+                                    <w14:lumOff w14:val="40000"/>
+                                  </w14:schemeClr>
+                                </w14:gs>
+                              </w14:gsLst>
+                              <w14:lin w14:ang="5400000" w14:scaled="0"/>
+                            </w14:gradFill>
+                          </w14:textFill>
+                        </w:rPr>
+                        <w:t>”</w:t>
+                      </w:r>
+                    </w:p>
+                  </w:txbxContent>
+                </v:textbox>
+                <w10:wrap type="square"/>
+              </v:shape>
+            </w:pict>
+          </mc:Fallback>
+        </mc:AlternateContent>
+      </w:r>
+    </w:p>
+    <w:p>
+      <w:pPr>
+        <w:ind w:left="708" w:hanging="708"/>
+        <w:rPr>
+          <w:sz w:val="24"/>
+          <w:szCs w:val="24"/>
+        </w:rPr>
+      </w:pPr>
+    </w:p>
+    <w:p>
+      <w:pPr>
+        <w:ind w:left="708" w:hanging="708"/>
+        <w:rPr>
+          <w:sz w:val="24"/>
+          <w:szCs w:val="24"/>
+        </w:rPr>
+      </w:pPr>
+      <w:r>
+        <w:rPr>
+          <w:noProof/>
+          <w:lang w:eastAsia="es-ES"/>
+        </w:rPr>
+        <w:drawing>
+          <wp:anchor distT="0" distB="0" distL="114300" distR="114300" simplePos="0" relativeHeight="251660288" behindDoc="0" locked="0" layoutInCell="1" allowOverlap="1" wp14:anchorId="7B26B92A" wp14:editId="5AC10B5D">
+            <wp:simplePos x="0" y="0"/>
+            <wp:positionH relativeFrom="margin">
+              <wp:align>center</wp:align>
+            </wp:positionH>
+            <wp:positionV relativeFrom="paragraph">
+              <wp:posOffset>22225</wp:posOffset>
+            </wp:positionV>
+            <wp:extent cx="4855210" cy="3289935"/>
+            <wp:effectExtent l="0" t="0" r="0" b="0"/>
+            <wp:wrapThrough wrapText="bothSides">
+              <wp:wrapPolygon edited="0">
+                <wp:start x="424" y="250"/>
+                <wp:lineTo x="424" y="21012"/>
+                <wp:lineTo x="21188" y="21012"/>
+                <wp:lineTo x="21188" y="750"/>
+                <wp:lineTo x="21103" y="250"/>
+                <wp:lineTo x="424" y="250"/>
+              </wp:wrapPolygon>
+            </wp:wrapThrough>
+            <wp:docPr id="4" name="Imagen 4" descr="C:\Users\USUARIO\Desktop\Ana\INGENIERÍA INFORMÁTICA\3º\1º CUATRIMESTRE\Tecnologías de Desarrollo de Software (TDS)\Prácticas\Práctica Requisitos\ventana inicio.png"/>
+            <wp:cNvGraphicFramePr>
+              <a:graphicFrameLocks xmlns:a="http://schemas.openxmlformats.org/drawingml/2006/main" noChangeAspect="1"/>
+            </wp:cNvGraphicFramePr>
+            <a:graphic xmlns:a="http://schemas.openxmlformats.org/drawingml/2006/main">
+              <a:graphicData uri="http://schemas.openxmlformats.org/drawingml/2006/picture">
+                <pic:pic xmlns:pic="http://schemas.openxmlformats.org/drawingml/2006/picture">
+                  <pic:nvPicPr>
+                    <pic:cNvPr id="0" name="Picture 1" descr="C:\Users\USUARIO\Desktop\Ana\INGENIERÍA INFORMÁTICA\3º\1º CUATRIMESTRE\Tecnologías de Desarrollo de Software (TDS)\Prácticas\Práctica Requisitos\ventana inicio.png"/>
+                    <pic:cNvPicPr>
+                      <a:picLocks noChangeAspect="1" noChangeArrowheads="1"/>
+                    </pic:cNvPicPr>
+                  </pic:nvPicPr>
+                  <pic:blipFill rotWithShape="1">
+                    <a:blip r:embed="rId8" cstate="print">
+                      <a:extLst>
+                        <a:ext uri="{28A0092B-C50C-407E-A947-70E740481C1C}">
+                          <a14:useLocalDpi xmlns:a14="http://schemas.microsoft.com/office/drawing/2010/main" val="0"/>
+                        </a:ext>
+                      </a:extLst>
+                    </a:blip>
+                    <a:srcRect l="4680" t="7351" r="4092" b="30830"/>
+                    <a:stretch/>
+                  </pic:blipFill>
+                  <pic:spPr bwMode="auto">
+                    <a:xfrm>
+                      <a:off x="0" y="0"/>
+                      <a:ext cx="4855210" cy="3289935"/>
+                    </a:xfrm>
+                    <a:prstGeom prst="rect">
+                      <a:avLst/>
+                    </a:prstGeom>
+                    <a:noFill/>
+                    <a:ln>
+                      <a:noFill/>
+                    </a:ln>
+                    <a:extLst>
+                      <a:ext uri="{53640926-AAD7-44D8-BBD7-CCE9431645EC}">
+                        <a14:shadowObscured xmlns:a14="http://schemas.microsoft.com/office/drawing/2010/main"/>
+                      </a:ext>
+                    </a:extLst>
+                  </pic:spPr>
+                </pic:pic>
+              </a:graphicData>
+            </a:graphic>
+            <wp14:sizeRelH relativeFrom="page">
+              <wp14:pctWidth>0</wp14:pctWidth>
+            </wp14:sizeRelH>
+            <wp14:sizeRelV relativeFrom="page">
+              <wp14:pctHeight>0</wp14:pctHeight>
+            </wp14:sizeRelV>
+          </wp:anchor>
+        </w:drawing>
+      </w:r>
+    </w:p>
+    <w:p>
+      <w:pPr>
+        <w:ind w:left="708" w:hanging="708"/>
+        <w:rPr>
+          <w:sz w:val="24"/>
+          <w:szCs w:val="24"/>
+        </w:rPr>
+      </w:pPr>
+    </w:p>
+    <w:p>
+      <w:pPr>
+        <w:ind w:left="708" w:hanging="708"/>
+        <w:rPr>
+          <w:sz w:val="24"/>
+          <w:szCs w:val="24"/>
+        </w:rPr>
+      </w:pPr>
+    </w:p>
+    <w:p>
+      <w:pPr>
+        <w:ind w:left="708" w:hanging="708"/>
+        <w:rPr>
+          <w:sz w:val="24"/>
+          <w:szCs w:val="24"/>
+        </w:rPr>
+      </w:pPr>
+    </w:p>
+    <w:p>
+      <w:pPr>
+        <w:ind w:left="708" w:hanging="708"/>
+        <w:rPr>
+          <w:sz w:val="24"/>
+          <w:szCs w:val="24"/>
+        </w:rPr>
+      </w:pPr>
+    </w:p>
+    <w:p>
+      <w:pPr>
+        <w:ind w:left="708" w:hanging="708"/>
+        <w:rPr>
+          <w:sz w:val="24"/>
+          <w:szCs w:val="24"/>
+        </w:rPr>
+      </w:pPr>
+    </w:p>
+    <w:p>
+      <w:pPr>
+        <w:ind w:left="708" w:hanging="708"/>
+        <w:rPr>
+          <w:sz w:val="24"/>
+          <w:szCs w:val="24"/>
+        </w:rPr>
+      </w:pPr>
+    </w:p>
+    <w:p>
+      <w:pPr>
+        <w:ind w:left="708" w:hanging="708"/>
+        <w:rPr>
+          <w:sz w:val="24"/>
+          <w:szCs w:val="24"/>
+        </w:rPr>
+      </w:pPr>
     </w:p>
     <w:p>
       <w:pPr>
         <w:ind w:left="708" w:hanging="708"/>
         <w:jc w:val="center"/>
         <w:rPr>
-          <w:sz w:val="40"/>
-          <w:szCs w:val="40"/>
-        </w:rPr>
-      </w:pPr>
-      <w:r>
-        <w:rPr>
-          <w:sz w:val="40"/>
-          <w:szCs w:val="40"/>
-        </w:rPr>
-        <w:t>“</w:t>
-      </w:r>
-      <w:proofErr w:type="spellStart"/>
-      <w:r>
-        <w:rPr>
-          <w:sz w:val="40"/>
-          <w:szCs w:val="40"/>
-        </w:rPr>
-        <w:t>AppChat</w:t>
-      </w:r>
-      <w:proofErr w:type="spellEnd"/>
-      <w:r>
-        <w:rPr>
-          <w:sz w:val="40"/>
-          <w:szCs w:val="40"/>
-        </w:rPr>
-        <w:t>”</w:t>
-      </w:r>
-    </w:p>
-    <w:p>
-      <w:pPr>
-        <w:ind w:left="708" w:hanging="708"/>
-        <w:rPr>
           <w:sz w:val="24"/>
           <w:szCs w:val="24"/>
         </w:rPr>
@@ -101,6 +860,7 @@
     <w:p>
       <w:pPr>
         <w:ind w:left="708" w:hanging="708"/>
+        <w:jc w:val="center"/>
         <w:rPr>
           <w:sz w:val="24"/>
           <w:szCs w:val="24"/>
@@ -116,13 +876,16 @@
           <w:szCs w:val="24"/>
         </w:rPr>
       </w:pPr>
-      <w:r>
+    </w:p>
+    <w:p>
+      <w:pPr>
+        <w:ind w:left="708" w:hanging="708"/>
+        <w:jc w:val="center"/>
         <w:rPr>
           <w:sz w:val="24"/>
           <w:szCs w:val="24"/>
         </w:rPr>
-        <w:t>Tecnologías del Desarrollo Software</w:t>
-      </w:r>
+      </w:pPr>
     </w:p>
     <w:p>
       <w:pPr>
@@ -133,19 +896,22 @@
           <w:szCs w:val="24"/>
         </w:rPr>
       </w:pPr>
-      <w:r>
+    </w:p>
+    <w:p>
+      <w:pPr>
+        <w:ind w:left="708" w:hanging="708"/>
+        <w:jc w:val="center"/>
         <w:rPr>
           <w:sz w:val="24"/>
           <w:szCs w:val="24"/>
         </w:rPr>
-        <w:t>Profesor: Francisco Javier Bermúdez Ru</w:t>
-      </w:r>
+      </w:pPr>
       <w:r>
         <w:rPr>
           <w:sz w:val="24"/>
           <w:szCs w:val="24"/>
         </w:rPr>
-        <w:t>iz</w:t>
+        <w:t>Tecnologías del Desarrollo Software</w:t>
       </w:r>
     </w:p>
     <w:p>
@@ -157,6 +923,20 @@
           <w:szCs w:val="24"/>
         </w:rPr>
       </w:pPr>
+      <w:r>
+        <w:rPr>
+          <w:sz w:val="24"/>
+          <w:szCs w:val="24"/>
+        </w:rPr>
+        <w:t>Profesor: Francisco Javier Bermúdez Ru</w:t>
+      </w:r>
+      <w:r>
+        <w:rPr>
+          <w:sz w:val="24"/>
+          <w:szCs w:val="24"/>
+        </w:rPr>
+        <w:t>iz</w:t>
+      </w:r>
     </w:p>
     <w:p>
       <w:pPr>
@@ -190,6 +970,11 @@
     </w:p>
     <w:p>
       <w:pPr>
+        <w:pStyle w:val="NormalWeb"/>
+      </w:pPr>
+    </w:p>
+    <w:p>
+      <w:pPr>
         <w:ind w:left="708" w:hanging="708"/>
         <w:jc w:val="center"/>
         <w:rPr>
@@ -200,162 +985,21 @@
     </w:p>
     <w:p>
       <w:pPr>
-        <w:ind w:left="708" w:hanging="708"/>
         <w:jc w:val="center"/>
         <w:rPr>
-          <w:sz w:val="24"/>
+          <w:b/>
+          <w:sz w:val="40"/>
           <w:szCs w:val="24"/>
-        </w:rPr>
-      </w:pPr>
-    </w:p>
-    <w:p>
-      <w:pPr>
-        <w:ind w:left="708" w:hanging="708"/>
-        <w:jc w:val="center"/>
-        <w:rPr>
-          <w:sz w:val="24"/>
+          <w:u w:val="single"/>
+        </w:rPr>
+      </w:pPr>
+      <w:r>
+        <w:rPr>
+          <w:b/>
+          <w:sz w:val="40"/>
           <w:szCs w:val="24"/>
-        </w:rPr>
-      </w:pPr>
-    </w:p>
-    <w:p>
-      <w:pPr>
-        <w:ind w:left="708" w:hanging="708"/>
-        <w:jc w:val="center"/>
-        <w:rPr>
-          <w:sz w:val="24"/>
-          <w:szCs w:val="24"/>
-        </w:rPr>
-      </w:pPr>
-    </w:p>
-    <w:p>
-      <w:pPr>
-        <w:ind w:left="708" w:hanging="708"/>
-        <w:jc w:val="center"/>
-        <w:rPr>
-          <w:sz w:val="24"/>
-          <w:szCs w:val="24"/>
-        </w:rPr>
-      </w:pPr>
-    </w:p>
-    <w:p>
-      <w:pPr>
-        <w:ind w:left="708" w:hanging="708"/>
-        <w:jc w:val="center"/>
-        <w:rPr>
-          <w:sz w:val="24"/>
-          <w:szCs w:val="24"/>
-        </w:rPr>
-      </w:pPr>
-    </w:p>
-    <w:p>
-      <w:pPr>
-        <w:ind w:left="708" w:hanging="708"/>
-        <w:jc w:val="center"/>
-        <w:rPr>
-          <w:sz w:val="24"/>
-          <w:szCs w:val="24"/>
-        </w:rPr>
-      </w:pPr>
-    </w:p>
-    <w:p>
-      <w:pPr>
-        <w:ind w:left="708" w:hanging="708"/>
-        <w:jc w:val="center"/>
-        <w:rPr>
-          <w:sz w:val="24"/>
-          <w:szCs w:val="24"/>
-        </w:rPr>
-      </w:pPr>
-    </w:p>
-    <w:p>
-      <w:pPr>
-        <w:ind w:left="708" w:hanging="708"/>
-        <w:jc w:val="center"/>
-        <w:rPr>
-          <w:sz w:val="24"/>
-          <w:szCs w:val="24"/>
-        </w:rPr>
-      </w:pPr>
-    </w:p>
-    <w:p>
-      <w:pPr>
-        <w:ind w:left="708" w:hanging="708"/>
-        <w:jc w:val="center"/>
-        <w:rPr>
-          <w:sz w:val="24"/>
-          <w:szCs w:val="24"/>
-        </w:rPr>
-      </w:pPr>
-    </w:p>
-    <w:p>
-      <w:pPr>
-        <w:ind w:left="708" w:hanging="708"/>
-        <w:jc w:val="center"/>
-        <w:rPr>
-          <w:sz w:val="24"/>
-          <w:szCs w:val="24"/>
-        </w:rPr>
-      </w:pPr>
-    </w:p>
-    <w:p>
-      <w:pPr>
-        <w:ind w:left="708" w:hanging="708"/>
-        <w:jc w:val="center"/>
-        <w:rPr>
-          <w:sz w:val="24"/>
-          <w:szCs w:val="24"/>
-        </w:rPr>
-      </w:pPr>
-    </w:p>
-    <w:p>
-      <w:pPr>
-        <w:ind w:left="708" w:hanging="708"/>
-        <w:jc w:val="center"/>
-        <w:rPr>
-          <w:sz w:val="24"/>
-          <w:szCs w:val="24"/>
-        </w:rPr>
-      </w:pPr>
-    </w:p>
-    <w:p>
-      <w:pPr>
-        <w:ind w:left="708" w:hanging="708"/>
-        <w:jc w:val="center"/>
-        <w:rPr>
-          <w:sz w:val="24"/>
-          <w:szCs w:val="24"/>
-        </w:rPr>
-      </w:pPr>
-    </w:p>
-    <w:p>
-      <w:pPr>
-        <w:rPr>
-          <w:sz w:val="24"/>
-          <w:szCs w:val="24"/>
-        </w:rPr>
-      </w:pPr>
-      <w:r>
-        <w:rPr>
-          <w:sz w:val="24"/>
-          <w:szCs w:val="24"/>
-        </w:rPr>
-        <w:br w:type="page"/>
-      </w:r>
-    </w:p>
-    <w:p>
-      <w:pPr>
-        <w:rPr>
-          <w:sz w:val="28"/>
-          <w:szCs w:val="24"/>
-        </w:rPr>
-      </w:pPr>
-      <w:r>
-        <w:rPr>
-          <w:sz w:val="28"/>
-          <w:szCs w:val="24"/>
-        </w:rPr>
-        <w:lastRenderedPageBreak/>
+          <w:u w:val="single"/>
+        </w:rPr>
         <w:t>ÍNDICE</w:t>
       </w:r>
     </w:p>
@@ -366,31 +1010,47 @@
           <w:tab w:val="right" w:leader="dot" w:pos="8494"/>
         </w:tabs>
         <w:rPr>
-          <w:noProof/>
-        </w:rPr>
-      </w:pPr>
-      <w:r>
-        <w:rPr>
           <w:sz w:val="24"/>
           <w:szCs w:val="24"/>
         </w:rPr>
-        <w:fldChar w:fldCharType="begin"/>
-      </w:r>
+      </w:pPr>
+    </w:p>
+    <w:p>
+      <w:pPr>
+        <w:pStyle w:val="TDC1"/>
+        <w:tabs>
+          <w:tab w:val="right" w:leader="dot" w:pos="8494"/>
+        </w:tabs>
+        <w:rPr>
+          <w:rFonts w:eastAsiaTheme="minorEastAsia"/>
+          <w:noProof/>
+          <w:kern w:val="0"/>
+          <w:lang w:eastAsia="es-ES"/>
+          <w14:ligatures w14:val="none"/>
+        </w:rPr>
+      </w:pPr>
       <w:r>
         <w:rPr>
           <w:sz w:val="24"/>
           <w:szCs w:val="24"/>
         </w:rPr>
-        <w:instrText xml:space="preserve"> TOC \o "1-3" \h \z \u </w:instrText>
+        <w:fldChar w:fldCharType="begin"/>
       </w:r>
       <w:r>
         <w:rPr>
           <w:sz w:val="24"/>
           <w:szCs w:val="24"/>
         </w:rPr>
+        <w:instrText xml:space="preserve"> TOC \o "1-3" \h \z \u </w:instrText>
+      </w:r>
+      <w:r>
+        <w:rPr>
+          <w:sz w:val="24"/>
+          <w:szCs w:val="24"/>
+        </w:rPr>
         <w:fldChar w:fldCharType="separate"/>
       </w:r>
-      <w:hyperlink w:anchor="_Toc179983215" w:history="1">
+      <w:hyperlink w:anchor="_Toc179991430" w:history="1">
         <w:r>
           <w:rPr>
             <w:rStyle w:val="Hipervnculo"/>
@@ -417,7 +1077,7 @@
             <w:noProof/>
             <w:webHidden/>
           </w:rPr>
-          <w:instrText xml:space="preserve"> PAGEREF _Toc179983215 \h </w:instrText>
+          <w:instrText xml:space="preserve"> PAGEREF _Toc179991430 \h </w:instrText>
         </w:r>
         <w:r>
           <w:rPr>
@@ -455,10 +1115,26 @@
           <w:tab w:val="right" w:leader="dot" w:pos="8494"/>
         </w:tabs>
         <w:rPr>
+          <w:rStyle w:val="Hipervnculo"/>
           <w:noProof/>
         </w:rPr>
       </w:pPr>
-      <w:hyperlink w:anchor="_Toc179983216" w:history="1">
+    </w:p>
+    <w:p>
+      <w:pPr>
+        <w:pStyle w:val="TDC1"/>
+        <w:tabs>
+          <w:tab w:val="right" w:leader="dot" w:pos="8494"/>
+        </w:tabs>
+        <w:rPr>
+          <w:rFonts w:eastAsiaTheme="minorEastAsia"/>
+          <w:noProof/>
+          <w:kern w:val="0"/>
+          <w:lang w:eastAsia="es-ES"/>
+          <w14:ligatures w14:val="none"/>
+        </w:rPr>
+      </w:pPr>
+      <w:hyperlink w:anchor="_Toc179991431" w:history="1">
         <w:r>
           <w:rPr>
             <w:rStyle w:val="Hipervnculo"/>
@@ -485,7 +1161,7 @@
             <w:noProof/>
             <w:webHidden/>
           </w:rPr>
-          <w:instrText xml:space="preserve"> PAGEREF _Toc179983216 \h </w:instrText>
+          <w:instrText xml:space="preserve"> PAGEREF _Toc179991431 \h </w:instrText>
         </w:r>
         <w:r>
           <w:rPr>
@@ -523,10 +1199,26 @@
           <w:tab w:val="right" w:leader="dot" w:pos="8494"/>
         </w:tabs>
         <w:rPr>
+          <w:rStyle w:val="Hipervnculo"/>
           <w:noProof/>
         </w:rPr>
       </w:pPr>
-      <w:hyperlink w:anchor="_Toc179983217" w:history="1">
+    </w:p>
+    <w:p>
+      <w:pPr>
+        <w:pStyle w:val="TDC1"/>
+        <w:tabs>
+          <w:tab w:val="right" w:leader="dot" w:pos="8494"/>
+        </w:tabs>
+        <w:rPr>
+          <w:rFonts w:eastAsiaTheme="minorEastAsia"/>
+          <w:noProof/>
+          <w:kern w:val="0"/>
+          <w:lang w:eastAsia="es-ES"/>
+          <w14:ligatures w14:val="none"/>
+        </w:rPr>
+      </w:pPr>
+      <w:hyperlink w:anchor="_Toc179991432" w:history="1">
         <w:r>
           <w:rPr>
             <w:rStyle w:val="Hipervnculo"/>
@@ -553,7 +1245,7 @@
             <w:noProof/>
             <w:webHidden/>
           </w:rPr>
-          <w:instrText xml:space="preserve"> PAGEREF _Toc179983217 \h </w:instrText>
+          <w:instrText xml:space="preserve"> PAGEREF _Toc179991432 \h </w:instrText>
         </w:r>
         <w:r>
           <w:rPr>
@@ -573,7 +1265,7 @@
             <w:noProof/>
             <w:webHidden/>
           </w:rPr>
-          <w:t>6</w:t>
+          <w:t>9</w:t>
         </w:r>
         <w:r>
           <w:rPr>
@@ -591,10 +1283,26 @@
           <w:tab w:val="right" w:leader="dot" w:pos="8494"/>
         </w:tabs>
         <w:rPr>
+          <w:rStyle w:val="Hipervnculo"/>
           <w:noProof/>
         </w:rPr>
       </w:pPr>
-      <w:hyperlink w:anchor="_Toc179983218" w:history="1">
+    </w:p>
+    <w:p>
+      <w:pPr>
+        <w:pStyle w:val="TDC1"/>
+        <w:tabs>
+          <w:tab w:val="right" w:leader="dot" w:pos="8494"/>
+        </w:tabs>
+        <w:rPr>
+          <w:rFonts w:eastAsiaTheme="minorEastAsia"/>
+          <w:noProof/>
+          <w:kern w:val="0"/>
+          <w:lang w:eastAsia="es-ES"/>
+          <w14:ligatures w14:val="none"/>
+        </w:rPr>
+      </w:pPr>
+      <w:hyperlink w:anchor="_Toc179991433" w:history="1">
         <w:r>
           <w:rPr>
             <w:rStyle w:val="Hipervnculo"/>
@@ -621,7 +1329,7 @@
             <w:noProof/>
             <w:webHidden/>
           </w:rPr>
-          <w:instrText xml:space="preserve"> PAGEREF _Toc179983218 \h </w:instrText>
+          <w:instrText xml:space="preserve"> PAGEREF _Toc179991433 \h </w:instrText>
         </w:r>
         <w:r>
           <w:rPr>
@@ -641,7 +1349,7 @@
             <w:noProof/>
             <w:webHidden/>
           </w:rPr>
-          <w:t>7</w:t>
+          <w:t>10</w:t>
         </w:r>
         <w:r>
           <w:rPr>
@@ -659,10 +1367,26 @@
           <w:tab w:val="right" w:leader="dot" w:pos="8494"/>
         </w:tabs>
         <w:rPr>
+          <w:rStyle w:val="Hipervnculo"/>
           <w:noProof/>
         </w:rPr>
       </w:pPr>
-      <w:hyperlink w:anchor="_Toc179983219" w:history="1">
+    </w:p>
+    <w:p>
+      <w:pPr>
+        <w:pStyle w:val="TDC1"/>
+        <w:tabs>
+          <w:tab w:val="right" w:leader="dot" w:pos="8494"/>
+        </w:tabs>
+        <w:rPr>
+          <w:rFonts w:eastAsiaTheme="minorEastAsia"/>
+          <w:noProof/>
+          <w:kern w:val="0"/>
+          <w:lang w:eastAsia="es-ES"/>
+          <w14:ligatures w14:val="none"/>
+        </w:rPr>
+      </w:pPr>
+      <w:hyperlink w:anchor="_Toc179991434" w:history="1">
         <w:r>
           <w:rPr>
             <w:rStyle w:val="Hipervnculo"/>
@@ -689,7 +1413,7 @@
             <w:noProof/>
             <w:webHidden/>
           </w:rPr>
-          <w:instrText xml:space="preserve"> PAGEREF _Toc179983219 \h </w:instrText>
+          <w:instrText xml:space="preserve"> PAGEREF _Toc179991434 \h </w:instrText>
         </w:r>
         <w:r>
           <w:rPr>
@@ -709,7 +1433,7 @@
             <w:noProof/>
             <w:webHidden/>
           </w:rPr>
-          <w:t>8</w:t>
+          <w:t>11</w:t>
         </w:r>
         <w:r>
           <w:rPr>
@@ -855,103 +1579,12 @@
     </w:p>
     <w:p>
       <w:pPr>
-        <w:ind w:left="708" w:hanging="708"/>
-        <w:rPr>
-          <w:sz w:val="24"/>
-          <w:szCs w:val="24"/>
-        </w:rPr>
-      </w:pPr>
-    </w:p>
-    <w:p>
-      <w:pPr>
-        <w:ind w:left="708" w:hanging="708"/>
-        <w:rPr>
-          <w:sz w:val="24"/>
-          <w:szCs w:val="24"/>
-        </w:rPr>
-      </w:pPr>
-    </w:p>
-    <w:p>
-      <w:pPr>
-        <w:ind w:left="708" w:hanging="708"/>
-        <w:rPr>
-          <w:sz w:val="24"/>
-          <w:szCs w:val="24"/>
-        </w:rPr>
-      </w:pPr>
-    </w:p>
-    <w:p>
-      <w:pPr>
-        <w:ind w:left="708" w:hanging="708"/>
-        <w:rPr>
-          <w:sz w:val="24"/>
-          <w:szCs w:val="24"/>
-        </w:rPr>
-      </w:pPr>
-    </w:p>
-    <w:p>
-      <w:pPr>
-        <w:ind w:left="708" w:hanging="708"/>
-        <w:rPr>
-          <w:sz w:val="24"/>
-          <w:szCs w:val="24"/>
-        </w:rPr>
-      </w:pPr>
-    </w:p>
-    <w:p>
-      <w:pPr>
-        <w:ind w:left="708" w:hanging="708"/>
-        <w:rPr>
-          <w:sz w:val="24"/>
-          <w:szCs w:val="24"/>
-        </w:rPr>
-      </w:pPr>
-    </w:p>
-    <w:p>
-      <w:pPr>
-        <w:ind w:left="708" w:hanging="708"/>
-        <w:rPr>
-          <w:sz w:val="24"/>
-          <w:szCs w:val="24"/>
-        </w:rPr>
-      </w:pPr>
-    </w:p>
-    <w:p>
-      <w:pPr>
-        <w:ind w:left="708" w:hanging="708"/>
-        <w:rPr>
-          <w:sz w:val="24"/>
-          <w:szCs w:val="24"/>
-        </w:rPr>
-      </w:pPr>
-    </w:p>
-    <w:p>
-      <w:pPr>
-        <w:ind w:left="708" w:hanging="708"/>
-        <w:rPr>
-          <w:sz w:val="24"/>
-          <w:szCs w:val="24"/>
-        </w:rPr>
-      </w:pPr>
-    </w:p>
-    <w:p>
-      <w:pPr>
-        <w:ind w:left="708" w:hanging="708"/>
-        <w:rPr>
-          <w:sz w:val="24"/>
-          <w:szCs w:val="24"/>
-        </w:rPr>
-      </w:pPr>
-    </w:p>
-    <w:p>
-      <w:pPr>
         <w:rPr>
           <w:rFonts w:ascii="Arial Black" w:eastAsiaTheme="majorEastAsia" w:hAnsi="Arial Black" w:cstheme="majorBidi"/>
           <w:sz w:val="32"/>
           <w:szCs w:val="40"/>
         </w:rPr>
       </w:pPr>
-      <w:bookmarkStart w:id="0" w:name="_Toc179983215"/>
       <w:r>
         <w:br w:type="page"/>
       </w:r>
@@ -960,6 +1593,7 @@
       <w:pPr>
         <w:pStyle w:val="Ttulo1"/>
       </w:pPr>
+      <w:bookmarkStart w:id="0" w:name="_Toc179991430"/>
       <w:r>
         <w:rPr>
           <w:noProof/>
@@ -990,7 +1624,7 @@
                     <pic:cNvPicPr/>
                   </pic:nvPicPr>
                   <pic:blipFill>
-                    <a:blip r:embed="rId6">
+                    <a:blip r:embed="rId9">
                       <a:extLst>
                         <a:ext uri="{28A0092B-C50C-407E-A947-70E740481C1C}">
                           <a14:useLocalDpi xmlns:a14="http://schemas.microsoft.com/office/drawing/2010/main" val="0"/>
@@ -1072,7 +1706,6 @@
     <w:p/>
     <w:p/>
     <w:p>
-      <w:bookmarkStart w:id="1" w:name="_Toc179983216"/>
       <w:r>
         <w:br w:type="page"/>
       </w:r>
@@ -1081,12 +1714,14 @@
       <w:pPr>
         <w:pStyle w:val="Ttulo1"/>
       </w:pPr>
+      <w:bookmarkStart w:id="1" w:name="_Toc179991431"/>
       <w:r>
         <w:lastRenderedPageBreak/>
         <w:t>Historias de usuario</w:t>
       </w:r>
       <w:bookmarkEnd w:id="1"/>
     </w:p>
+    <w:p/>
     <w:p>
       <w:pPr>
         <w:jc w:val="both"/>
@@ -1283,6 +1918,86 @@
       </w:pPr>
       <w:r>
         <w:rPr>
+          <w:noProof/>
+          <w:lang w:eastAsia="es-ES"/>
+        </w:rPr>
+        <w:drawing>
+          <wp:anchor distT="0" distB="0" distL="114300" distR="114300" simplePos="0" relativeHeight="251663360" behindDoc="0" locked="0" layoutInCell="1" allowOverlap="1" wp14:anchorId="26DE2CDA" wp14:editId="398917A9">
+            <wp:simplePos x="0" y="0"/>
+            <wp:positionH relativeFrom="margin">
+              <wp:align>center</wp:align>
+            </wp:positionH>
+            <wp:positionV relativeFrom="paragraph">
+              <wp:posOffset>243664</wp:posOffset>
+            </wp:positionV>
+            <wp:extent cx="4610735" cy="3096260"/>
+            <wp:effectExtent l="0" t="0" r="0" b="0"/>
+            <wp:wrapThrough wrapText="bothSides">
+              <wp:wrapPolygon edited="0">
+                <wp:start x="0" y="0"/>
+                <wp:lineTo x="0" y="21396"/>
+                <wp:lineTo x="21329" y="21396"/>
+                <wp:lineTo x="21329" y="532"/>
+                <wp:lineTo x="21151" y="0"/>
+                <wp:lineTo x="0" y="0"/>
+              </wp:wrapPolygon>
+            </wp:wrapThrough>
+            <wp:docPr id="6" name="Imagen 6" descr="C:\Users\USUARIO\Desktop\Ana\INGENIERÍA INFORMÁTICA\3º\1º CUATRIMESTRE\Tecnologías de Desarrollo de Software (TDS)\Prácticas\Práctica Requisitos\ventana inicio sesión.png"/>
+            <wp:cNvGraphicFramePr>
+              <a:graphicFrameLocks xmlns:a="http://schemas.openxmlformats.org/drawingml/2006/main" noChangeAspect="1"/>
+            </wp:cNvGraphicFramePr>
+            <a:graphic xmlns:a="http://schemas.openxmlformats.org/drawingml/2006/main">
+              <a:graphicData uri="http://schemas.openxmlformats.org/drawingml/2006/picture">
+                <pic:pic xmlns:pic="http://schemas.openxmlformats.org/drawingml/2006/picture">
+                  <pic:nvPicPr>
+                    <pic:cNvPr id="0" name="Picture 3" descr="C:\Users\USUARIO\Desktop\Ana\INGENIERÍA INFORMÁTICA\3º\1º CUATRIMESTRE\Tecnologías de Desarrollo de Software (TDS)\Prácticas\Práctica Requisitos\ventana inicio sesión.png"/>
+                    <pic:cNvPicPr>
+                      <a:picLocks noChangeAspect="1" noChangeArrowheads="1"/>
+                    </pic:cNvPicPr>
+                  </pic:nvPicPr>
+                  <pic:blipFill rotWithShape="1">
+                    <a:blip r:embed="rId10" cstate="print">
+                      <a:extLst>
+                        <a:ext uri="{28A0092B-C50C-407E-A947-70E740481C1C}">
+                          <a14:useLocalDpi xmlns:a14="http://schemas.microsoft.com/office/drawing/2010/main" val="0"/>
+                        </a:ext>
+                      </a:extLst>
+                    </a:blip>
+                    <a:srcRect l="6253" t="7978" r="4498" b="32092"/>
+                    <a:stretch/>
+                  </pic:blipFill>
+                  <pic:spPr bwMode="auto">
+                    <a:xfrm>
+                      <a:off x="0" y="0"/>
+                      <a:ext cx="4610735" cy="3096260"/>
+                    </a:xfrm>
+                    <a:prstGeom prst="rect">
+                      <a:avLst/>
+                    </a:prstGeom>
+                    <a:noFill/>
+                    <a:ln>
+                      <a:noFill/>
+                    </a:ln>
+                    <a:extLst>
+                      <a:ext uri="{53640926-AAD7-44D8-BBD7-CCE9431645EC}">
+                        <a14:shadowObscured xmlns:a14="http://schemas.microsoft.com/office/drawing/2010/main"/>
+                      </a:ext>
+                    </a:extLst>
+                  </pic:spPr>
+                </pic:pic>
+              </a:graphicData>
+            </a:graphic>
+            <wp14:sizeRelH relativeFrom="page">
+              <wp14:pctWidth>0</wp14:pctWidth>
+            </wp14:sizeRelH>
+            <wp14:sizeRelV relativeFrom="page">
+              <wp14:pctHeight>0</wp14:pctHeight>
+            </wp14:sizeRelV>
+          </wp:anchor>
+        </w:drawing>
+      </w:r>
+      <w:r>
+        <w:rPr>
           <w:b/>
           <w:bCs/>
         </w:rPr>
@@ -1291,6 +2006,71 @@
       <w:r>
         <w:t xml:space="preserve"> inicia sesión con dichos datos y sus mensajes y contactos</w:t>
       </w:r>
+    </w:p>
+    <w:p>
+      <w:pPr>
+        <w:ind w:left="1080"/>
+        <w:jc w:val="both"/>
+      </w:pPr>
+    </w:p>
+    <w:p>
+      <w:pPr>
+        <w:pStyle w:val="NormalWeb"/>
+      </w:pPr>
+    </w:p>
+    <w:p>
+      <w:pPr>
+        <w:ind w:left="1080"/>
+        <w:jc w:val="both"/>
+      </w:pPr>
+    </w:p>
+    <w:p>
+      <w:pPr>
+        <w:ind w:left="1080"/>
+        <w:jc w:val="both"/>
+      </w:pPr>
+    </w:p>
+    <w:p>
+      <w:pPr>
+        <w:ind w:left="1080"/>
+        <w:jc w:val="both"/>
+      </w:pPr>
+    </w:p>
+    <w:p>
+      <w:pPr>
+        <w:ind w:left="1080"/>
+        <w:jc w:val="both"/>
+      </w:pPr>
+    </w:p>
+    <w:p>
+      <w:pPr>
+        <w:ind w:left="1080"/>
+        <w:jc w:val="both"/>
+      </w:pPr>
+    </w:p>
+    <w:p>
+      <w:pPr>
+        <w:ind w:left="1080"/>
+        <w:jc w:val="both"/>
+      </w:pPr>
+    </w:p>
+    <w:p>
+      <w:pPr>
+        <w:ind w:left="1080"/>
+        <w:jc w:val="both"/>
+      </w:pPr>
+    </w:p>
+    <w:p>
+      <w:pPr>
+        <w:ind w:left="1080"/>
+        <w:jc w:val="both"/>
+      </w:pPr>
+    </w:p>
+    <w:p>
+      <w:pPr>
+        <w:ind w:left="1080"/>
+        <w:jc w:val="both"/>
+      </w:pPr>
     </w:p>
     <w:p>
       <w:pPr>
@@ -1371,13 +2151,36 @@
     </w:p>
     <w:p>
       <w:pPr>
-        <w:jc w:val="both"/>
-      </w:pPr>
-      <w:r>
-        <w:rPr>
-          <w:b/>
-          <w:bCs/>
-        </w:rPr>
+        <w:pStyle w:val="Prrafodelista"/>
+        <w:ind w:left="1440"/>
+        <w:jc w:val="both"/>
+      </w:pPr>
+    </w:p>
+    <w:p>
+      <w:pPr>
+        <w:rPr>
+          <w:b/>
+          <w:bCs/>
+        </w:rPr>
+      </w:pPr>
+      <w:r>
+        <w:rPr>
+          <w:b/>
+          <w:bCs/>
+        </w:rPr>
+        <w:br w:type="page"/>
+      </w:r>
+    </w:p>
+    <w:p>
+      <w:pPr>
+        <w:jc w:val="both"/>
+      </w:pPr>
+      <w:r>
+        <w:rPr>
+          <w:b/>
+          <w:bCs/>
+        </w:rPr>
+        <w:lastRenderedPageBreak/>
         <w:t>Actividad</w:t>
       </w:r>
       <w:r>
@@ -1564,6 +2367,130 @@
     <w:p>
       <w:pPr>
         <w:pStyle w:val="Prrafodelista"/>
+        <w:ind w:left="1440"/>
+        <w:jc w:val="both"/>
+        <w:rPr>
+          <w:b/>
+          <w:bCs/>
+        </w:rPr>
+      </w:pPr>
+      <w:r>
+        <w:rPr>
+          <w:noProof/>
+          <w:lang w:eastAsia="es-ES"/>
+        </w:rPr>
+        <w:drawing>
+          <wp:anchor distT="0" distB="0" distL="114300" distR="114300" simplePos="0" relativeHeight="251664384" behindDoc="0" locked="0" layoutInCell="1" allowOverlap="1" wp14:anchorId="0306912E" wp14:editId="30205D6F">
+            <wp:simplePos x="0" y="0"/>
+            <wp:positionH relativeFrom="margin">
+              <wp:align>center</wp:align>
+            </wp:positionH>
+            <wp:positionV relativeFrom="paragraph">
+              <wp:posOffset>161925</wp:posOffset>
+            </wp:positionV>
+            <wp:extent cx="4717415" cy="3171825"/>
+            <wp:effectExtent l="0" t="0" r="6985" b="9525"/>
+            <wp:wrapThrough wrapText="bothSides">
+              <wp:wrapPolygon edited="0">
+                <wp:start x="0" y="0"/>
+                <wp:lineTo x="0" y="21535"/>
+                <wp:lineTo x="21545" y="21535"/>
+                <wp:lineTo x="21545" y="0"/>
+                <wp:lineTo x="0" y="0"/>
+              </wp:wrapPolygon>
+            </wp:wrapThrough>
+            <wp:docPr id="7" name="Imagen 7" descr="C:\Users\USUARIO\Desktop\Ana\INGENIERÍA INFORMÁTICA\3º\1º CUATRIMESTRE\Tecnologías de Desarrollo de Software (TDS)\Prácticas\Práctica Requisitos\ventana añadir contacto.png"/>
+            <wp:cNvGraphicFramePr>
+              <a:graphicFrameLocks xmlns:a="http://schemas.openxmlformats.org/drawingml/2006/main" noChangeAspect="1"/>
+            </wp:cNvGraphicFramePr>
+            <a:graphic xmlns:a="http://schemas.openxmlformats.org/drawingml/2006/main">
+              <a:graphicData uri="http://schemas.openxmlformats.org/drawingml/2006/picture">
+                <pic:pic xmlns:pic="http://schemas.openxmlformats.org/drawingml/2006/picture">
+                  <pic:nvPicPr>
+                    <pic:cNvPr id="0" name="Picture 5" descr="C:\Users\USUARIO\Desktop\Ana\INGENIERÍA INFORMÁTICA\3º\1º CUATRIMESTRE\Tecnologías de Desarrollo de Software (TDS)\Prácticas\Práctica Requisitos\ventana añadir contacto.png"/>
+                    <pic:cNvPicPr>
+                      <a:picLocks noChangeAspect="1" noChangeArrowheads="1"/>
+                    </pic:cNvPicPr>
+                  </pic:nvPicPr>
+                  <pic:blipFill rotWithShape="1">
+                    <a:blip r:embed="rId11" cstate="print">
+                      <a:extLst>
+                        <a:ext uri="{28A0092B-C50C-407E-A947-70E740481C1C}">
+                          <a14:useLocalDpi xmlns:a14="http://schemas.microsoft.com/office/drawing/2010/main" val="0"/>
+                        </a:ext>
+                      </a:extLst>
+                    </a:blip>
+                    <a:srcRect l="6706" t="8196" r="5176" b="32561"/>
+                    <a:stretch/>
+                  </pic:blipFill>
+                  <pic:spPr bwMode="auto">
+                    <a:xfrm>
+                      <a:off x="0" y="0"/>
+                      <a:ext cx="4717415" cy="3171825"/>
+                    </a:xfrm>
+                    <a:prstGeom prst="rect">
+                      <a:avLst/>
+                    </a:prstGeom>
+                    <a:noFill/>
+                    <a:ln>
+                      <a:noFill/>
+                    </a:ln>
+                    <a:extLst>
+                      <a:ext uri="{53640926-AAD7-44D8-BBD7-CCE9431645EC}">
+                        <a14:shadowObscured xmlns:a14="http://schemas.microsoft.com/office/drawing/2010/main"/>
+                      </a:ext>
+                    </a:extLst>
+                  </pic:spPr>
+                </pic:pic>
+              </a:graphicData>
+            </a:graphic>
+            <wp14:sizeRelH relativeFrom="page">
+              <wp14:pctWidth>0</wp14:pctWidth>
+            </wp14:sizeRelH>
+            <wp14:sizeRelV relativeFrom="page">
+              <wp14:pctHeight>0</wp14:pctHeight>
+            </wp14:sizeRelV>
+          </wp:anchor>
+        </w:drawing>
+      </w:r>
+    </w:p>
+    <w:p>
+      <w:pPr>
+        <w:pStyle w:val="NormalWeb"/>
+      </w:pPr>
+    </w:p>
+    <w:p>
+      <w:pPr>
+        <w:pStyle w:val="Prrafodelista"/>
+        <w:ind w:left="1440"/>
+        <w:jc w:val="both"/>
+        <w:rPr>
+          <w:b/>
+          <w:bCs/>
+        </w:rPr>
+      </w:pPr>
+    </w:p>
+    <w:p>
+      <w:pPr>
+        <w:pStyle w:val="Prrafodelista"/>
+        <w:ind w:left="1440"/>
+        <w:jc w:val="both"/>
+        <w:rPr>
+          <w:b/>
+          <w:bCs/>
+        </w:rPr>
+      </w:pPr>
+    </w:p>
+    <w:p>
+      <w:pPr>
+        <w:pStyle w:val="Prrafodelista"/>
+        <w:ind w:left="1440"/>
+        <w:jc w:val="both"/>
+      </w:pPr>
+    </w:p>
+    <w:p>
+      <w:pPr>
+        <w:pStyle w:val="Prrafodelista"/>
         <w:numPr>
           <w:ilvl w:val="0"/>
           <w:numId w:val="3"/>
@@ -2008,6 +2935,85 @@
       </w:pPr>
       <w:r>
         <w:rPr>
+          <w:noProof/>
+          <w:lang w:eastAsia="es-ES"/>
+        </w:rPr>
+        <w:drawing>
+          <wp:anchor distT="0" distB="0" distL="114300" distR="114300" simplePos="0" relativeHeight="251665408" behindDoc="1" locked="0" layoutInCell="1" allowOverlap="1" wp14:anchorId="017CC52E" wp14:editId="156E82B4">
+            <wp:simplePos x="0" y="0"/>
+            <wp:positionH relativeFrom="margin">
+              <wp:align>center</wp:align>
+            </wp:positionH>
+            <wp:positionV relativeFrom="paragraph">
+              <wp:posOffset>255729</wp:posOffset>
+            </wp:positionV>
+            <wp:extent cx="4921885" cy="3281045"/>
+            <wp:effectExtent l="0" t="0" r="0" b="0"/>
+            <wp:wrapThrough wrapText="bothSides">
+              <wp:wrapPolygon edited="0">
+                <wp:start x="167" y="0"/>
+                <wp:lineTo x="84" y="21445"/>
+                <wp:lineTo x="21486" y="21445"/>
+                <wp:lineTo x="21486" y="0"/>
+                <wp:lineTo x="167" y="0"/>
+              </wp:wrapPolygon>
+            </wp:wrapThrough>
+            <wp:docPr id="8" name="Imagen 8" descr="C:\Users\USUARIO\Desktop\Ana\INGENIERÍA INFORMÁTICA\3º\1º CUATRIMESTRE\Tecnologías de Desarrollo de Software (TDS)\Prácticas\Práctica Requisitos\ventana intercanbio de mensajes.png"/>
+            <wp:cNvGraphicFramePr>
+              <a:graphicFrameLocks xmlns:a="http://schemas.openxmlformats.org/drawingml/2006/main" noChangeAspect="1"/>
+            </wp:cNvGraphicFramePr>
+            <a:graphic xmlns:a="http://schemas.openxmlformats.org/drawingml/2006/main">
+              <a:graphicData uri="http://schemas.openxmlformats.org/drawingml/2006/picture">
+                <pic:pic xmlns:pic="http://schemas.openxmlformats.org/drawingml/2006/picture">
+                  <pic:nvPicPr>
+                    <pic:cNvPr id="0" name="Picture 7" descr="C:\Users\USUARIO\Desktop\Ana\INGENIERÍA INFORMÁTICA\3º\1º CUATRIMESTRE\Tecnologías de Desarrollo de Software (TDS)\Prácticas\Práctica Requisitos\ventana intercanbio de mensajes.png"/>
+                    <pic:cNvPicPr>
+                      <a:picLocks noChangeAspect="1" noChangeArrowheads="1"/>
+                    </pic:cNvPicPr>
+                  </pic:nvPicPr>
+                  <pic:blipFill rotWithShape="1">
+                    <a:blip r:embed="rId12" cstate="print">
+                      <a:extLst>
+                        <a:ext uri="{28A0092B-C50C-407E-A947-70E740481C1C}">
+                          <a14:useLocalDpi xmlns:a14="http://schemas.microsoft.com/office/drawing/2010/main" val="0"/>
+                        </a:ext>
+                      </a:extLst>
+                    </a:blip>
+                    <a:srcRect l="5771" t="8175" r="5260" b="32512"/>
+                    <a:stretch/>
+                  </pic:blipFill>
+                  <pic:spPr bwMode="auto">
+                    <a:xfrm>
+                      <a:off x="0" y="0"/>
+                      <a:ext cx="4921885" cy="3281045"/>
+                    </a:xfrm>
+                    <a:prstGeom prst="rect">
+                      <a:avLst/>
+                    </a:prstGeom>
+                    <a:noFill/>
+                    <a:ln>
+                      <a:noFill/>
+                    </a:ln>
+                    <a:extLst>
+                      <a:ext uri="{53640926-AAD7-44D8-BBD7-CCE9431645EC}">
+                        <a14:shadowObscured xmlns:a14="http://schemas.microsoft.com/office/drawing/2010/main"/>
+                      </a:ext>
+                    </a:extLst>
+                  </pic:spPr>
+                </pic:pic>
+              </a:graphicData>
+            </a:graphic>
+            <wp14:sizeRelH relativeFrom="margin">
+              <wp14:pctWidth>0</wp14:pctWidth>
+            </wp14:sizeRelH>
+            <wp14:sizeRelV relativeFrom="margin">
+              <wp14:pctHeight>0</wp14:pctHeight>
+            </wp14:sizeRelV>
+          </wp:anchor>
+        </w:drawing>
+      </w:r>
+      <w:r>
+        <w:rPr>
           <w:b/>
           <w:bCs/>
         </w:rPr>
@@ -2016,6 +3022,13 @@
       <w:r>
         <w:t xml:space="preserve"> el sistema envía el mensaje</w:t>
       </w:r>
+    </w:p>
+    <w:p>
+      <w:pPr>
+        <w:pStyle w:val="Prrafodelista"/>
+        <w:ind w:left="1440"/>
+        <w:jc w:val="both"/>
+      </w:pPr>
     </w:p>
     <w:p>
       <w:pPr>
@@ -2097,13 +3110,29 @@
     </w:p>
     <w:p>
       <w:pPr>
-        <w:jc w:val="both"/>
-      </w:pPr>
-      <w:r>
-        <w:rPr>
-          <w:b/>
-          <w:bCs/>
-        </w:rPr>
+        <w:rPr>
+          <w:b/>
+          <w:bCs/>
+        </w:rPr>
+      </w:pPr>
+      <w:r>
+        <w:rPr>
+          <w:b/>
+          <w:bCs/>
+        </w:rPr>
+        <w:br w:type="page"/>
+      </w:r>
+    </w:p>
+    <w:p>
+      <w:pPr>
+        <w:jc w:val="both"/>
+      </w:pPr>
+      <w:r>
+        <w:rPr>
+          <w:b/>
+          <w:bCs/>
+        </w:rPr>
+        <w:lastRenderedPageBreak/>
         <w:t>Actividad</w:t>
       </w:r>
       <w:r>
@@ -2278,6 +3307,87 @@
       </w:pPr>
       <w:r>
         <w:rPr>
+          <w:noProof/>
+          <w:lang w:eastAsia="es-ES"/>
+        </w:rPr>
+        <w:drawing>
+          <wp:anchor distT="0" distB="0" distL="114300" distR="114300" simplePos="0" relativeHeight="251666432" behindDoc="0" locked="0" layoutInCell="1" allowOverlap="1" wp14:anchorId="19D9D777" wp14:editId="4DA97DAF">
+            <wp:simplePos x="0" y="0"/>
+            <wp:positionH relativeFrom="margin">
+              <wp:align>center</wp:align>
+            </wp:positionH>
+            <wp:positionV relativeFrom="paragraph">
+              <wp:posOffset>372393</wp:posOffset>
+            </wp:positionV>
+            <wp:extent cx="5077839" cy="3404681"/>
+            <wp:effectExtent l="0" t="0" r="8890" b="0"/>
+            <wp:wrapThrough wrapText="bothSides">
+              <wp:wrapPolygon edited="0">
+                <wp:start x="162" y="0"/>
+                <wp:lineTo x="81" y="363"/>
+                <wp:lineTo x="0" y="21395"/>
+                <wp:lineTo x="21557" y="21395"/>
+                <wp:lineTo x="21476" y="242"/>
+                <wp:lineTo x="21233" y="0"/>
+                <wp:lineTo x="162" y="0"/>
+              </wp:wrapPolygon>
+            </wp:wrapThrough>
+            <wp:docPr id="9" name="Imagen 9" descr="C:\Users\USUARIO\Desktop\Ana\INGENIERÍA INFORMÁTICA\3º\1º CUATRIMESTRE\Tecnologías de Desarrollo de Software (TDS)\Prácticas\Práctica Requisitos\ventana busqueda mensaje.png"/>
+            <wp:cNvGraphicFramePr>
+              <a:graphicFrameLocks xmlns:a="http://schemas.openxmlformats.org/drawingml/2006/main" noChangeAspect="1"/>
+            </wp:cNvGraphicFramePr>
+            <a:graphic xmlns:a="http://schemas.openxmlformats.org/drawingml/2006/main">
+              <a:graphicData uri="http://schemas.openxmlformats.org/drawingml/2006/picture">
+                <pic:pic xmlns:pic="http://schemas.openxmlformats.org/drawingml/2006/picture">
+                  <pic:nvPicPr>
+                    <pic:cNvPr id="0" name="Picture 9" descr="C:\Users\USUARIO\Desktop\Ana\INGENIERÍA INFORMÁTICA\3º\1º CUATRIMESTRE\Tecnologías de Desarrollo de Software (TDS)\Prácticas\Práctica Requisitos\ventana busqueda mensaje.png"/>
+                    <pic:cNvPicPr>
+                      <a:picLocks noChangeAspect="1" noChangeArrowheads="1"/>
+                    </pic:cNvPicPr>
+                  </pic:nvPicPr>
+                  <pic:blipFill rotWithShape="1">
+                    <a:blip r:embed="rId13" cstate="print">
+                      <a:extLst>
+                        <a:ext uri="{28A0092B-C50C-407E-A947-70E740481C1C}">
+                          <a14:useLocalDpi xmlns:a14="http://schemas.microsoft.com/office/drawing/2010/main" val="0"/>
+                        </a:ext>
+                      </a:extLst>
+                    </a:blip>
+                    <a:srcRect l="6114" t="8321" r="5236" b="32239"/>
+                    <a:stretch/>
+                  </pic:blipFill>
+                  <pic:spPr bwMode="auto">
+                    <a:xfrm>
+                      <a:off x="0" y="0"/>
+                      <a:ext cx="5077839" cy="3404681"/>
+                    </a:xfrm>
+                    <a:prstGeom prst="rect">
+                      <a:avLst/>
+                    </a:prstGeom>
+                    <a:noFill/>
+                    <a:ln>
+                      <a:noFill/>
+                    </a:ln>
+                    <a:extLst>
+                      <a:ext uri="{53640926-AAD7-44D8-BBD7-CCE9431645EC}">
+                        <a14:shadowObscured xmlns:a14="http://schemas.microsoft.com/office/drawing/2010/main"/>
+                      </a:ext>
+                    </a:extLst>
+                  </pic:spPr>
+                </pic:pic>
+              </a:graphicData>
+            </a:graphic>
+            <wp14:sizeRelH relativeFrom="page">
+              <wp14:pctWidth>0</wp14:pctWidth>
+            </wp14:sizeRelH>
+            <wp14:sizeRelV relativeFrom="page">
+              <wp14:pctHeight>0</wp14:pctHeight>
+            </wp14:sizeRelV>
+          </wp:anchor>
+        </w:drawing>
+      </w:r>
+      <w:r>
+        <w:rPr>
           <w:b/>
           <w:bCs/>
         </w:rPr>
@@ -2455,23 +3565,11 @@
     </w:p>
     <w:p>
       <w:pPr>
-        <w:jc w:val="both"/>
-      </w:pPr>
-    </w:p>
-    <w:p>
-      <w:pPr>
-        <w:rPr>
-          <w:b/>
-          <w:bCs/>
-        </w:rPr>
-      </w:pPr>
-      <w:r>
-        <w:rPr>
-          <w:b/>
-          <w:bCs/>
-        </w:rPr>
-        <w:br w:type="page"/>
-      </w:r>
+        <w:rPr>
+          <w:b/>
+          <w:bCs/>
+        </w:rPr>
+      </w:pPr>
     </w:p>
     <w:p>
       <w:pPr>
@@ -2657,6 +3755,85 @@
       </w:pPr>
       <w:r>
         <w:rPr>
+          <w:noProof/>
+          <w:lang w:eastAsia="es-ES"/>
+        </w:rPr>
+        <w:drawing>
+          <wp:anchor distT="0" distB="0" distL="114300" distR="114300" simplePos="0" relativeHeight="251667456" behindDoc="0" locked="0" layoutInCell="1" allowOverlap="1" wp14:anchorId="0DC881A2" wp14:editId="4FB34152">
+            <wp:simplePos x="0" y="0"/>
+            <wp:positionH relativeFrom="margin">
+              <wp:align>center</wp:align>
+            </wp:positionH>
+            <wp:positionV relativeFrom="paragraph">
+              <wp:posOffset>245974</wp:posOffset>
+            </wp:positionV>
+            <wp:extent cx="5086985" cy="3408045"/>
+            <wp:effectExtent l="0" t="0" r="0" b="1905"/>
+            <wp:wrapThrough wrapText="bothSides">
+              <wp:wrapPolygon edited="0">
+                <wp:start x="81" y="121"/>
+                <wp:lineTo x="81" y="21491"/>
+                <wp:lineTo x="21436" y="21491"/>
+                <wp:lineTo x="21436" y="121"/>
+                <wp:lineTo x="81" y="121"/>
+              </wp:wrapPolygon>
+            </wp:wrapThrough>
+            <wp:docPr id="10" name="Imagen 10" descr="C:\Users\USUARIO\Desktop\Ana\INGENIERÍA INFORMÁTICA\3º\1º CUATRIMESTRE\Tecnologías de Desarrollo de Software (TDS)\Prácticas\Práctica Requisitos\ventana añadir contacto.png"/>
+            <wp:cNvGraphicFramePr>
+              <a:graphicFrameLocks xmlns:a="http://schemas.openxmlformats.org/drawingml/2006/main" noChangeAspect="1"/>
+            </wp:cNvGraphicFramePr>
+            <a:graphic xmlns:a="http://schemas.openxmlformats.org/drawingml/2006/main">
+              <a:graphicData uri="http://schemas.openxmlformats.org/drawingml/2006/picture">
+                <pic:pic xmlns:pic="http://schemas.openxmlformats.org/drawingml/2006/picture">
+                  <pic:nvPicPr>
+                    <pic:cNvPr id="0" name="Picture 11" descr="C:\Users\USUARIO\Desktop\Ana\INGENIERÍA INFORMÁTICA\3º\1º CUATRIMESTRE\Tecnologías de Desarrollo de Software (TDS)\Prácticas\Práctica Requisitos\ventana añadir contacto.png"/>
+                    <pic:cNvPicPr>
+                      <a:picLocks noChangeAspect="1" noChangeArrowheads="1"/>
+                    </pic:cNvPicPr>
+                  </pic:nvPicPr>
+                  <pic:blipFill rotWithShape="1">
+                    <a:blip r:embed="rId14" cstate="print">
+                      <a:extLst>
+                        <a:ext uri="{28A0092B-C50C-407E-A947-70E740481C1C}">
+                          <a14:useLocalDpi xmlns:a14="http://schemas.microsoft.com/office/drawing/2010/main" val="0"/>
+                        </a:ext>
+                      </a:extLst>
+                    </a:blip>
+                    <a:srcRect l="6152" t="7911" r="4884" b="32487"/>
+                    <a:stretch/>
+                  </pic:blipFill>
+                  <pic:spPr bwMode="auto">
+                    <a:xfrm>
+                      <a:off x="0" y="0"/>
+                      <a:ext cx="5086985" cy="3408045"/>
+                    </a:xfrm>
+                    <a:prstGeom prst="rect">
+                      <a:avLst/>
+                    </a:prstGeom>
+                    <a:noFill/>
+                    <a:ln>
+                      <a:noFill/>
+                    </a:ln>
+                    <a:extLst>
+                      <a:ext uri="{53640926-AAD7-44D8-BBD7-CCE9431645EC}">
+                        <a14:shadowObscured xmlns:a14="http://schemas.microsoft.com/office/drawing/2010/main"/>
+                      </a:ext>
+                    </a:extLst>
+                  </pic:spPr>
+                </pic:pic>
+              </a:graphicData>
+            </a:graphic>
+            <wp14:sizeRelH relativeFrom="margin">
+              <wp14:pctWidth>0</wp14:pctWidth>
+            </wp14:sizeRelH>
+            <wp14:sizeRelV relativeFrom="margin">
+              <wp14:pctHeight>0</wp14:pctHeight>
+            </wp14:sizeRelV>
+          </wp:anchor>
+        </w:drawing>
+      </w:r>
+      <w:r>
+        <w:rPr>
           <w:b/>
           <w:bCs/>
         </w:rPr>
@@ -2665,6 +3842,17 @@
       <w:r>
         <w:t xml:space="preserve"> el sistema reemplaza la foto anterior con esta nueva</w:t>
       </w:r>
+    </w:p>
+    <w:p>
+      <w:pPr>
+        <w:pStyle w:val="Prrafodelista"/>
+        <w:ind w:left="1440"/>
+        <w:jc w:val="both"/>
+        <w:rPr>
+          <w:b/>
+          <w:bCs/>
+        </w:rPr>
+      </w:pPr>
     </w:p>
     <w:p>
       <w:pPr>
@@ -2903,8 +4091,9 @@
       <w:pPr>
         <w:pStyle w:val="Ttulo1"/>
       </w:pPr>
-      <w:bookmarkStart w:id="2" w:name="_Toc179983217"/>
-      <w:r>
+      <w:bookmarkStart w:id="2" w:name="_Toc179991432"/>
+      <w:r>
+        <w:lastRenderedPageBreak/>
         <w:t>Requisitos NO funcionales</w:t>
       </w:r>
       <w:bookmarkEnd w:id="2"/>
@@ -3077,9 +4266,11 @@
       <w:pPr>
         <w:pStyle w:val="Ttulo1"/>
         <w:sectPr>
+          <w:footerReference w:type="default" r:id="rId15"/>
           <w:pgSz w:w="11906" w:h="16838"/>
           <w:pgMar w:top="1417" w:right="1701" w:bottom="1417" w:left="1701" w:header="708" w:footer="708" w:gutter="0"/>
           <w:cols w:space="708"/>
+          <w:titlePg/>
           <w:docGrid w:linePitch="360"/>
         </w:sectPr>
       </w:pPr>
@@ -3088,7 +4279,7 @@
       <w:pPr>
         <w:pStyle w:val="Ttulo1"/>
       </w:pPr>
-      <w:bookmarkStart w:id="3" w:name="_Toc179983218"/>
+      <w:bookmarkStart w:id="3" w:name="_Toc179991433"/>
       <w:r>
         <w:lastRenderedPageBreak/>
         <w:t>Diagrama de clases (UML)</w:t>
@@ -3120,7 +4311,7 @@
                     <pic:cNvPicPr/>
                   </pic:nvPicPr>
                   <pic:blipFill>
-                    <a:blip r:embed="rId7"/>
+                    <a:blip r:embed="rId16"/>
                     <a:stretch>
                       <a:fillRect/>
                     </a:stretch>
@@ -3141,7 +4332,6 @@
         </w:drawing>
       </w:r>
     </w:p>
-    <w:p/>
     <w:p>
       <w:pPr>
         <w:sectPr>
@@ -3156,7 +4346,7 @@
       <w:pPr>
         <w:pStyle w:val="Ttulo1"/>
       </w:pPr>
-      <w:bookmarkStart w:id="4" w:name="_Toc179983219"/>
+      <w:bookmarkStart w:id="4" w:name="_Toc179991434"/>
       <w:r>
         <w:lastRenderedPageBreak/>
         <w:t>Comentarios sobre el diagrama</w:t>
@@ -3181,6 +4371,7 @@
       <w:proofErr w:type="spellStart"/>
       <w:r>
         <w:rPr>
+          <w:i/>
           <w:u w:val="single"/>
         </w:rPr>
         <w:t>Enviador</w:t>
@@ -3199,7 +4390,12 @@
         <w:t xml:space="preserve">Se trata de una </w:t>
       </w:r>
       <w:r>
-        <w:t xml:space="preserve">clase sería un ejemplo de clase Servicio de DDD. En este caso la operación del negocio es </w:t>
+        <w:t>clase</w:t>
+      </w:r>
+      <w:bookmarkStart w:id="5" w:name="_GoBack"/>
+      <w:bookmarkEnd w:id="5"/>
+      <w:r>
+        <w:t xml:space="preserve"> Servicio de DDD. En este caso la operación del negocio es </w:t>
       </w:r>
       <w:r>
         <w:t>enviar y recibir mensajes.</w:t>
@@ -3219,6 +4415,10 @@
         <w:jc w:val="center"/>
       </w:pPr>
       <w:r>
+        <w:rPr>
+          <w:noProof/>
+          <w:lang w:eastAsia="es-ES"/>
+        </w:rPr>
         <w:drawing>
           <wp:inline distT="0" distB="0" distL="0" distR="0" wp14:anchorId="6D9F89FD" wp14:editId="68774E21">
             <wp:extent cx="3533775" cy="2052336"/>
@@ -3235,7 +4435,7 @@
                     <pic:cNvPicPr/>
                   </pic:nvPicPr>
                   <pic:blipFill rotWithShape="1">
-                    <a:blip r:embed="rId8"/>
+                    <a:blip r:embed="rId17"/>
                     <a:srcRect l="9526" t="20740" r="4221" b="3741"/>
                     <a:stretch/>
                   </pic:blipFill>
@@ -3299,6 +4499,7 @@
           <w:rStyle w:val="fontstyle01"/>
           <w:rFonts w:asciiTheme="minorHAnsi" w:hAnsiTheme="minorHAnsi"/>
           <w:b w:val="0"/>
+          <w:i/>
           <w:u w:val="single"/>
         </w:rPr>
         <w:t>CreadorPDF</w:t>
@@ -3379,9 +4580,11 @@
         <w:rPr>
           <w:rStyle w:val="fontstyle21"/>
           <w:rFonts w:asciiTheme="minorHAnsi" w:hAnsiTheme="minorHAnsi"/>
+          <w:noProof/>
           <w:color w:val="auto"/>
           <w:sz w:val="22"/>
           <w:szCs w:val="22"/>
+          <w:lang w:eastAsia="es-ES"/>
         </w:rPr>
         <w:drawing>
           <wp:inline distT="0" distB="0" distL="0" distR="0" wp14:anchorId="4F1D6D6A" wp14:editId="1B1F04EB">
@@ -3399,7 +4602,7 @@
                     <pic:cNvPicPr/>
                   </pic:nvPicPr>
                   <pic:blipFill>
-                    <a:blip r:embed="rId9"/>
+                    <a:blip r:embed="rId18"/>
                     <a:stretch>
                       <a:fillRect/>
                     </a:stretch>
@@ -3441,9 +4644,424 @@
           <w:numId w:val="7"/>
         </w:numPr>
         <w:jc w:val="both"/>
-      </w:pPr>
-      <w:bookmarkStart w:id="5" w:name="_GoBack"/>
-      <w:bookmarkEnd w:id="5"/>
+        <w:rPr>
+          <w:rStyle w:val="fontstyle11"/>
+          <w:rFonts w:asciiTheme="minorHAnsi" w:hAnsiTheme="minorHAnsi"/>
+        </w:rPr>
+      </w:pPr>
+      <w:proofErr w:type="spellStart"/>
+      <w:r>
+        <w:rPr>
+          <w:rStyle w:val="fontstyle01"/>
+          <w:rFonts w:asciiTheme="minorHAnsi" w:hAnsiTheme="minorHAnsi"/>
+          <w:b w:val="0"/>
+          <w:i/>
+          <w:u w:val="single"/>
+        </w:rPr>
+        <w:t>RepositorioUsuarios</w:t>
+      </w:r>
+      <w:proofErr w:type="spellEnd"/>
+      <w:r>
+        <w:rPr>
+          <w:rStyle w:val="fontstyle11"/>
+          <w:rFonts w:asciiTheme="minorHAnsi" w:hAnsiTheme="minorHAnsi"/>
+          <w:b/>
+          <w:u w:val="single"/>
+        </w:rPr>
+        <w:t>:</w:t>
+      </w:r>
+      <w:r>
+        <w:rPr>
+          <w:rStyle w:val="fontstyle11"/>
+          <w:rFonts w:asciiTheme="minorHAnsi" w:hAnsiTheme="minorHAnsi"/>
+        </w:rPr>
+        <w:t xml:space="preserve"> Se man</w:t>
+      </w:r>
+      <w:r>
+        <w:rPr>
+          <w:rStyle w:val="fontstyle11"/>
+          <w:rFonts w:asciiTheme="minorHAnsi" w:hAnsiTheme="minorHAnsi"/>
+        </w:rPr>
+        <w:t>tendrá un repositorio para todos los usuarios registrados en el sistema y, por tanto, todos los usuarios a los que se les podría enviar un mensaje.</w:t>
+      </w:r>
+    </w:p>
+    <w:p>
+      <w:pPr>
+        <w:pStyle w:val="Prrafodelista"/>
+        <w:jc w:val="center"/>
+        <w:rPr>
+          <w:rStyle w:val="fontstyle11"/>
+          <w:rFonts w:asciiTheme="minorHAnsi" w:hAnsiTheme="minorHAnsi"/>
+          <w:b/>
+          <w:bCs/>
+        </w:rPr>
+      </w:pPr>
+      <w:r>
+        <w:rPr>
+          <w:rStyle w:val="fontstyle01"/>
+          <w:rFonts w:asciiTheme="minorHAnsi" w:hAnsiTheme="minorHAnsi"/>
+          <w:noProof/>
+          <w:lang w:eastAsia="es-ES"/>
+        </w:rPr>
+        <w:drawing>
+          <wp:inline distT="0" distB="0" distL="0" distR="0" wp14:anchorId="5D5662BA" wp14:editId="079A549E">
+            <wp:extent cx="3390900" cy="2707057"/>
+            <wp:effectExtent l="0" t="0" r="0" b="0"/>
+            <wp:docPr id="3" name="Imagen 3"/>
+            <wp:cNvGraphicFramePr>
+              <a:graphicFrameLocks xmlns:a="http://schemas.openxmlformats.org/drawingml/2006/main" noChangeAspect="1"/>
+            </wp:cNvGraphicFramePr>
+            <a:graphic xmlns:a="http://schemas.openxmlformats.org/drawingml/2006/main">
+              <a:graphicData uri="http://schemas.openxmlformats.org/drawingml/2006/picture">
+                <pic:pic xmlns:pic="http://schemas.openxmlformats.org/drawingml/2006/picture">
+                  <pic:nvPicPr>
+                    <pic:cNvPr id="1" name=""/>
+                    <pic:cNvPicPr/>
+                  </pic:nvPicPr>
+                  <pic:blipFill>
+                    <a:blip r:embed="rId19"/>
+                    <a:stretch>
+                      <a:fillRect/>
+                    </a:stretch>
+                  </pic:blipFill>
+                  <pic:spPr>
+                    <a:xfrm>
+                      <a:off x="0" y="0"/>
+                      <a:ext cx="3390900" cy="2707057"/>
+                    </a:xfrm>
+                    <a:prstGeom prst="rect">
+                      <a:avLst/>
+                    </a:prstGeom>
+                  </pic:spPr>
+                </pic:pic>
+              </a:graphicData>
+            </a:graphic>
+          </wp:inline>
+        </w:drawing>
+      </w:r>
+    </w:p>
+    <w:p>
+      <w:pPr>
+        <w:pStyle w:val="Prrafodelista"/>
+        <w:numPr>
+          <w:ilvl w:val="0"/>
+          <w:numId w:val="7"/>
+        </w:numPr>
+        <w:jc w:val="both"/>
+        <w:rPr>
+          <w:rStyle w:val="fontstyle01"/>
+          <w:rFonts w:asciiTheme="minorHAnsi" w:hAnsiTheme="minorHAnsi"/>
+          <w:b w:val="0"/>
+        </w:rPr>
+      </w:pPr>
+      <w:r>
+        <w:rPr>
+          <w:rStyle w:val="fontstyle01"/>
+          <w:rFonts w:asciiTheme="minorHAnsi" w:hAnsiTheme="minorHAnsi"/>
+          <w:b w:val="0"/>
+        </w:rPr>
+        <w:lastRenderedPageBreak/>
+        <w:t xml:space="preserve">Se han mostrado las </w:t>
+      </w:r>
+      <w:r>
+        <w:rPr>
+          <w:rStyle w:val="fontstyle21"/>
+          <w:rFonts w:asciiTheme="minorHAnsi" w:hAnsiTheme="minorHAnsi"/>
+        </w:rPr>
+        <w:t>relaciones</w:t>
+      </w:r>
+      <w:r>
+        <w:rPr>
+          <w:rStyle w:val="fontstyle21"/>
+          <w:rFonts w:asciiTheme="minorHAnsi" w:hAnsiTheme="minorHAnsi"/>
+          <w:b/>
+        </w:rPr>
+        <w:t xml:space="preserve"> </w:t>
+      </w:r>
+      <w:r>
+        <w:rPr>
+          <w:rStyle w:val="fontstyle01"/>
+          <w:rFonts w:asciiTheme="minorHAnsi" w:hAnsiTheme="minorHAnsi"/>
+          <w:b w:val="0"/>
+        </w:rPr>
+        <w:t>más importantes,</w:t>
+      </w:r>
+      <w:r>
+        <w:rPr>
+          <w:rStyle w:val="fontstyle01"/>
+          <w:rFonts w:asciiTheme="minorHAnsi" w:hAnsiTheme="minorHAnsi"/>
+          <w:b w:val="0"/>
+        </w:rPr>
+        <w:t xml:space="preserve"> por ejemplo, </w:t>
+      </w:r>
+      <w:proofErr w:type="spellStart"/>
+      <w:r>
+        <w:rPr>
+          <w:rStyle w:val="fontstyle31"/>
+          <w:rFonts w:asciiTheme="minorHAnsi" w:hAnsiTheme="minorHAnsi"/>
+          <w:i/>
+        </w:rPr>
+        <w:t>AppChat</w:t>
+      </w:r>
+      <w:proofErr w:type="spellEnd"/>
+      <w:r>
+        <w:rPr>
+          <w:rStyle w:val="fontstyle31"/>
+          <w:rFonts w:asciiTheme="minorHAnsi" w:hAnsiTheme="minorHAnsi"/>
+          <w:b/>
+        </w:rPr>
+        <w:t xml:space="preserve"> </w:t>
+      </w:r>
+      <w:r>
+        <w:rPr>
+          <w:rStyle w:val="fontstyle01"/>
+          <w:rFonts w:asciiTheme="minorHAnsi" w:hAnsiTheme="minorHAnsi"/>
+          <w:b w:val="0"/>
+        </w:rPr>
+        <w:t>estará relacionada con</w:t>
+      </w:r>
+      <w:r>
+        <w:rPr>
+          <w:rStyle w:val="fontstyle01"/>
+          <w:rFonts w:asciiTheme="minorHAnsi" w:hAnsiTheme="minorHAnsi"/>
+          <w:b w:val="0"/>
+        </w:rPr>
+        <w:t xml:space="preserve"> </w:t>
+      </w:r>
+      <w:r>
+        <w:rPr>
+          <w:rStyle w:val="fontstyle01"/>
+          <w:rFonts w:asciiTheme="minorHAnsi" w:hAnsiTheme="minorHAnsi"/>
+          <w:b w:val="0"/>
+        </w:rPr>
+        <w:t>casi todas las clases del dominio, pero sólo se han mostrado relaciones con los objetos servicio y</w:t>
+      </w:r>
+      <w:r>
+        <w:rPr>
+          <w:rStyle w:val="fontstyle01"/>
+          <w:rFonts w:asciiTheme="minorHAnsi" w:hAnsiTheme="minorHAnsi"/>
+          <w:b w:val="0"/>
+        </w:rPr>
+        <w:t xml:space="preserve"> </w:t>
+      </w:r>
+      <w:r>
+        <w:rPr>
+          <w:rStyle w:val="fontstyle01"/>
+          <w:rFonts w:asciiTheme="minorHAnsi" w:hAnsiTheme="minorHAnsi"/>
+          <w:b w:val="0"/>
+        </w:rPr>
+        <w:t xml:space="preserve">repositorios. Del mismo modo, sólo se han incluido unos pocos </w:t>
+      </w:r>
+      <w:r>
+        <w:rPr>
+          <w:rStyle w:val="fontstyle21"/>
+          <w:rFonts w:asciiTheme="minorHAnsi" w:hAnsiTheme="minorHAnsi"/>
+        </w:rPr>
+        <w:t>métodos</w:t>
+      </w:r>
+      <w:r>
+        <w:rPr>
+          <w:rStyle w:val="fontstyle21"/>
+          <w:rFonts w:asciiTheme="minorHAnsi" w:hAnsiTheme="minorHAnsi"/>
+          <w:b/>
+        </w:rPr>
+        <w:t xml:space="preserve"> </w:t>
+      </w:r>
+      <w:r>
+        <w:rPr>
+          <w:rStyle w:val="fontstyle01"/>
+          <w:rFonts w:asciiTheme="minorHAnsi" w:hAnsiTheme="minorHAnsi"/>
+          <w:b w:val="0"/>
+        </w:rPr>
+        <w:t>como es</w:t>
+      </w:r>
+      <w:r>
+        <w:rPr>
+          <w:rStyle w:val="fontstyle01"/>
+          <w:rFonts w:asciiTheme="minorHAnsi" w:hAnsiTheme="minorHAnsi"/>
+          <w:b w:val="0"/>
+        </w:rPr>
+        <w:t xml:space="preserve"> </w:t>
+      </w:r>
+      <w:r>
+        <w:rPr>
+          <w:rStyle w:val="fontstyle01"/>
+          <w:rFonts w:asciiTheme="minorHAnsi" w:hAnsiTheme="minorHAnsi"/>
+          <w:b w:val="0"/>
+        </w:rPr>
+        <w:t xml:space="preserve">habitual en los diagramas de clase. </w:t>
+      </w:r>
+    </w:p>
+    <w:p>
+      <w:pPr>
+        <w:pStyle w:val="Prrafodelista"/>
+        <w:jc w:val="both"/>
+        <w:rPr>
+          <w:rStyle w:val="fontstyle01"/>
+          <w:rFonts w:asciiTheme="minorHAnsi" w:hAnsiTheme="minorHAnsi"/>
+          <w:b w:val="0"/>
+        </w:rPr>
+      </w:pPr>
+    </w:p>
+    <w:p>
+      <w:pPr>
+        <w:pStyle w:val="Prrafodelista"/>
+        <w:numPr>
+          <w:ilvl w:val="0"/>
+          <w:numId w:val="7"/>
+        </w:numPr>
+        <w:jc w:val="both"/>
+        <w:rPr>
+          <w:bCs/>
+          <w:color w:val="000000"/>
+          <w:sz w:val="24"/>
+          <w:szCs w:val="24"/>
+        </w:rPr>
+      </w:pPr>
+      <w:r>
+        <w:rPr>
+          <w:bCs/>
+          <w:color w:val="000000"/>
+          <w:sz w:val="24"/>
+          <w:szCs w:val="24"/>
+        </w:rPr>
+        <w:t xml:space="preserve">Las clases persistentes serán </w:t>
+      </w:r>
+      <w:r>
+        <w:rPr>
+          <w:bCs/>
+          <w:i/>
+          <w:color w:val="000000"/>
+          <w:sz w:val="24"/>
+          <w:szCs w:val="24"/>
+        </w:rPr>
+        <w:t>Usuario</w:t>
+      </w:r>
+      <w:r>
+        <w:rPr>
+          <w:bCs/>
+          <w:color w:val="000000"/>
+          <w:sz w:val="24"/>
+          <w:szCs w:val="24"/>
+        </w:rPr>
+        <w:t xml:space="preserve">, </w:t>
+      </w:r>
+      <w:r>
+        <w:rPr>
+          <w:bCs/>
+          <w:i/>
+          <w:color w:val="000000"/>
+          <w:sz w:val="24"/>
+          <w:szCs w:val="24"/>
+        </w:rPr>
+        <w:t>Contacto</w:t>
+      </w:r>
+      <w:r>
+        <w:rPr>
+          <w:bCs/>
+          <w:color w:val="000000"/>
+          <w:sz w:val="24"/>
+          <w:szCs w:val="24"/>
+        </w:rPr>
+        <w:t xml:space="preserve">, </w:t>
+      </w:r>
+      <w:r>
+        <w:rPr>
+          <w:bCs/>
+          <w:i/>
+          <w:color w:val="000000"/>
+          <w:sz w:val="24"/>
+          <w:szCs w:val="24"/>
+        </w:rPr>
+        <w:t>Mensaje</w:t>
+      </w:r>
+      <w:r>
+        <w:rPr>
+          <w:bCs/>
+          <w:color w:val="000000"/>
+          <w:sz w:val="24"/>
+          <w:szCs w:val="24"/>
+        </w:rPr>
+        <w:t xml:space="preserve">, </w:t>
+      </w:r>
+      <w:proofErr w:type="spellStart"/>
+      <w:r>
+        <w:rPr>
+          <w:bCs/>
+          <w:i/>
+          <w:color w:val="000000"/>
+          <w:sz w:val="24"/>
+          <w:szCs w:val="24"/>
+        </w:rPr>
+        <w:t>ListaContactos</w:t>
+      </w:r>
+      <w:proofErr w:type="spellEnd"/>
+      <w:r>
+        <w:rPr>
+          <w:bCs/>
+          <w:color w:val="000000"/>
+          <w:sz w:val="24"/>
+          <w:szCs w:val="24"/>
+        </w:rPr>
+        <w:t xml:space="preserve"> y </w:t>
+      </w:r>
+      <w:proofErr w:type="spellStart"/>
+      <w:r>
+        <w:rPr>
+          <w:bCs/>
+          <w:i/>
+          <w:color w:val="000000"/>
+          <w:sz w:val="24"/>
+          <w:szCs w:val="24"/>
+        </w:rPr>
+        <w:t>ListaMensajes</w:t>
+      </w:r>
+      <w:proofErr w:type="spellEnd"/>
+      <w:r>
+        <w:rPr>
+          <w:bCs/>
+          <w:color w:val="000000"/>
+          <w:sz w:val="24"/>
+          <w:szCs w:val="24"/>
+        </w:rPr>
+        <w:t>.</w:t>
+      </w:r>
+    </w:p>
+    <w:p>
+      <w:pPr>
+        <w:pStyle w:val="Prrafodelista"/>
+        <w:jc w:val="both"/>
+        <w:rPr>
+          <w:bCs/>
+          <w:color w:val="000000"/>
+          <w:sz w:val="24"/>
+          <w:szCs w:val="24"/>
+        </w:rPr>
+      </w:pPr>
+    </w:p>
+    <w:p>
+      <w:pPr>
+        <w:pStyle w:val="Prrafodelista"/>
+        <w:numPr>
+          <w:ilvl w:val="0"/>
+          <w:numId w:val="7"/>
+        </w:numPr>
+        <w:jc w:val="both"/>
+        <w:rPr>
+          <w:bCs/>
+          <w:color w:val="000000"/>
+          <w:sz w:val="24"/>
+          <w:szCs w:val="24"/>
+        </w:rPr>
+      </w:pPr>
+      <w:r>
+        <w:rPr>
+          <w:rStyle w:val="fontstyle01"/>
+          <w:rFonts w:asciiTheme="minorHAnsi" w:hAnsiTheme="minorHAnsi"/>
+          <w:b w:val="0"/>
+        </w:rPr>
+        <w:t>Como siempre sucede, se trata de un diagrama de clases inicial que podría evolucionar durante la implementación.</w:t>
+      </w:r>
     </w:p>
     <w:sectPr>
       <w:pgSz w:w="11906" w:h="16838"/>
@@ -3455,9 +5073,194 @@
 </w:document>
 </file>
 
+<file path=word/endnotes.xml><?xml version="1.0" encoding="utf-8"?>
+<w:endnotes xmlns:wpc="http://schemas.microsoft.com/office/word/2010/wordprocessingCanvas" xmlns:cx="http://schemas.microsoft.com/office/drawing/2014/chartex" xmlns:mc="http://schemas.openxmlformats.org/markup-compatibility/2006" xmlns:o="urn:schemas-microsoft-com:office:office" xmlns:r="http://schemas.openxmlformats.org/officeDocument/2006/relationships" xmlns:m="http://schemas.openxmlformats.org/officeDocument/2006/math" xmlns:v="urn:schemas-microsoft-com:vml" xmlns:wp14="http://schemas.microsoft.com/office/word/2010/wordprocessingDrawing" xmlns:wp="http://schemas.openxmlformats.org/drawingml/2006/wordprocessingDrawing" xmlns:w10="urn:schemas-microsoft-com:office:word" xmlns:w="http://schemas.openxmlformats.org/wordprocessingml/2006/main" xmlns:w14="http://schemas.microsoft.com/office/word/2010/wordml" xmlns:w15="http://schemas.microsoft.com/office/word/2012/wordml" xmlns:w16se="http://schemas.microsoft.com/office/word/2015/wordml/symex" xmlns:wpg="http://schemas.microsoft.com/office/word/2010/wordprocessingGroup" xmlns:wpi="http://schemas.microsoft.com/office/word/2010/wordprocessingInk" xmlns:wne="http://schemas.microsoft.com/office/word/2006/wordml" xmlns:wps="http://schemas.microsoft.com/office/word/2010/wordprocessingShape" mc:Ignorable="w14 w15 w16se wp14">
+  <w:endnote w:type="separator" w:id="-1">
+    <w:p>
+      <w:pPr>
+        <w:spacing w:after="0" w:line="240" w:lineRule="auto"/>
+      </w:pPr>
+      <w:r>
+        <w:separator/>
+      </w:r>
+    </w:p>
+  </w:endnote>
+  <w:endnote w:type="continuationSeparator" w:id="0">
+    <w:p>
+      <w:pPr>
+        <w:spacing w:after="0" w:line="240" w:lineRule="auto"/>
+      </w:pPr>
+      <w:r>
+        <w:continuationSeparator/>
+      </w:r>
+    </w:p>
+  </w:endnote>
+</w:endnotes>
+</file>
+
+<file path=word/footer1.xml><?xml version="1.0" encoding="utf-8"?>
+<w:ftr xmlns:wpc="http://schemas.microsoft.com/office/word/2010/wordprocessingCanvas" xmlns:cx="http://schemas.microsoft.com/office/drawing/2014/chartex" xmlns:mc="http://schemas.openxmlformats.org/markup-compatibility/2006" xmlns:o="urn:schemas-microsoft-com:office:office" xmlns:r="http://schemas.openxmlformats.org/officeDocument/2006/relationships" xmlns:m="http://schemas.openxmlformats.org/officeDocument/2006/math" xmlns:v="urn:schemas-microsoft-com:vml" xmlns:wp14="http://schemas.microsoft.com/office/word/2010/wordprocessingDrawing" xmlns:wp="http://schemas.openxmlformats.org/drawingml/2006/wordprocessingDrawing" xmlns:w10="urn:schemas-microsoft-com:office:word" xmlns:w="http://schemas.openxmlformats.org/wordprocessingml/2006/main" xmlns:w14="http://schemas.microsoft.com/office/word/2010/wordml" xmlns:w15="http://schemas.microsoft.com/office/word/2012/wordml" xmlns:w16se="http://schemas.microsoft.com/office/word/2015/wordml/symex" xmlns:wpg="http://schemas.microsoft.com/office/word/2010/wordprocessingGroup" xmlns:wpi="http://schemas.microsoft.com/office/word/2010/wordprocessingInk" xmlns:wne="http://schemas.microsoft.com/office/word/2006/wordml" xmlns:wps="http://schemas.microsoft.com/office/word/2010/wordprocessingShape" mc:Ignorable="w14 w15 w16se wp14">
+  <w:sdt>
+    <w:sdtPr>
+      <w:id w:val="1571851972"/>
+      <w:docPartObj>
+        <w:docPartGallery w:val="Page Numbers (Bottom of Page)"/>
+        <w:docPartUnique/>
+      </w:docPartObj>
+    </w:sdtPr>
+    <w:sdtEndPr/>
+    <w:sdtContent>
+      <w:p>
+        <w:pPr>
+          <w:pStyle w:val="Piedepgina"/>
+          <w:jc w:val="right"/>
+        </w:pPr>
+        <w:r>
+          <w:fldChar w:fldCharType="begin"/>
+        </w:r>
+        <w:r>
+          <w:instrText>PAGE   \* MERGEFORMAT</w:instrText>
+        </w:r>
+        <w:r>
+          <w:fldChar w:fldCharType="separate"/>
+        </w:r>
+        <w:r>
+          <w:rPr>
+            <w:noProof/>
+          </w:rPr>
+          <w:t>12</w:t>
+        </w:r>
+        <w:r>
+          <w:fldChar w:fldCharType="end"/>
+        </w:r>
+      </w:p>
+    </w:sdtContent>
+  </w:sdt>
+  <w:p>
+    <w:pPr>
+      <w:pStyle w:val="Piedepgina"/>
+    </w:pPr>
+  </w:p>
+</w:ftr>
+</file>
+
+<file path=word/footnotes.xml><?xml version="1.0" encoding="utf-8"?>
+<w:footnotes xmlns:wpc="http://schemas.microsoft.com/office/word/2010/wordprocessingCanvas" xmlns:cx="http://schemas.microsoft.com/office/drawing/2014/chartex" xmlns:mc="http://schemas.openxmlformats.org/markup-compatibility/2006" xmlns:o="urn:schemas-microsoft-com:office:office" xmlns:r="http://schemas.openxmlformats.org/officeDocument/2006/relationships" xmlns:m="http://schemas.openxmlformats.org/officeDocument/2006/math" xmlns:v="urn:schemas-microsoft-com:vml" xmlns:wp14="http://schemas.microsoft.com/office/word/2010/wordprocessingDrawing" xmlns:wp="http://schemas.openxmlformats.org/drawingml/2006/wordprocessingDrawing" xmlns:w10="urn:schemas-microsoft-com:office:word" xmlns:w="http://schemas.openxmlformats.org/wordprocessingml/2006/main" xmlns:w14="http://schemas.microsoft.com/office/word/2010/wordml" xmlns:w15="http://schemas.microsoft.com/office/word/2012/wordml" xmlns:w16se="http://schemas.microsoft.com/office/word/2015/wordml/symex" xmlns:wpg="http://schemas.microsoft.com/office/word/2010/wordprocessingGroup" xmlns:wpi="http://schemas.microsoft.com/office/word/2010/wordprocessingInk" xmlns:wne="http://schemas.microsoft.com/office/word/2006/wordml" xmlns:wps="http://schemas.microsoft.com/office/word/2010/wordprocessingShape" mc:Ignorable="w14 w15 w16se wp14">
+  <w:footnote w:type="separator" w:id="-1">
+    <w:p>
+      <w:pPr>
+        <w:spacing w:after="0" w:line="240" w:lineRule="auto"/>
+      </w:pPr>
+      <w:r>
+        <w:separator/>
+      </w:r>
+    </w:p>
+  </w:footnote>
+  <w:footnote w:type="continuationSeparator" w:id="0">
+    <w:p>
+      <w:pPr>
+        <w:spacing w:after="0" w:line="240" w:lineRule="auto"/>
+      </w:pPr>
+      <w:r>
+        <w:continuationSeparator/>
+      </w:r>
+    </w:p>
+  </w:footnote>
+</w:footnotes>
+</file>
+
 <file path=word/numbering.xml><?xml version="1.0" encoding="utf-8"?>
 <w:numbering xmlns:wpc="http://schemas.microsoft.com/office/word/2010/wordprocessingCanvas" xmlns:cx="http://schemas.microsoft.com/office/drawing/2014/chartex" xmlns:mc="http://schemas.openxmlformats.org/markup-compatibility/2006" xmlns:o="urn:schemas-microsoft-com:office:office" xmlns:r="http://schemas.openxmlformats.org/officeDocument/2006/relationships" xmlns:m="http://schemas.openxmlformats.org/officeDocument/2006/math" xmlns:v="urn:schemas-microsoft-com:vml" xmlns:wp14="http://schemas.microsoft.com/office/word/2010/wordprocessingDrawing" xmlns:wp="http://schemas.openxmlformats.org/drawingml/2006/wordprocessingDrawing" xmlns:w10="urn:schemas-microsoft-com:office:word" xmlns:w="http://schemas.openxmlformats.org/wordprocessingml/2006/main" xmlns:w14="http://schemas.microsoft.com/office/word/2010/wordml" xmlns:w15="http://schemas.microsoft.com/office/word/2012/wordml" xmlns:w16se="http://schemas.microsoft.com/office/word/2015/wordml/symex" xmlns:wpg="http://schemas.microsoft.com/office/word/2010/wordprocessingGroup" xmlns:wpi="http://schemas.microsoft.com/office/word/2010/wordprocessingInk" xmlns:wne="http://schemas.microsoft.com/office/word/2006/wordml" xmlns:wps="http://schemas.microsoft.com/office/word/2010/wordprocessingShape" mc:Ignorable="w14 w15 w16se wp14">
   <w:abstractNum w:abstractNumId="0" w15:restartNumberingAfterBreak="0">
+    <w:nsid w:val="018631A3"/>
+    <w:multiLevelType w:val="hybridMultilevel"/>
+    <w:tmpl w:val="0A04AF74"/>
+    <w:lvl w:ilvl="0" w:tplc="0C0A000F">
+      <w:start w:val="1"/>
+      <w:numFmt w:val="decimal"/>
+      <w:lvlText w:val="%1."/>
+      <w:lvlJc w:val="left"/>
+      <w:pPr>
+        <w:ind w:left="720" w:hanging="360"/>
+      </w:pPr>
+      <w:rPr>
+        <w:rFonts w:hint="default"/>
+      </w:rPr>
+    </w:lvl>
+    <w:lvl w:ilvl="1" w:tplc="0C0A0019" w:tentative="1">
+      <w:start w:val="1"/>
+      <w:numFmt w:val="lowerLetter"/>
+      <w:lvlText w:val="%2."/>
+      <w:lvlJc w:val="left"/>
+      <w:pPr>
+        <w:ind w:left="1440" w:hanging="360"/>
+      </w:pPr>
+    </w:lvl>
+    <w:lvl w:ilvl="2" w:tplc="0C0A001B" w:tentative="1">
+      <w:start w:val="1"/>
+      <w:numFmt w:val="lowerRoman"/>
+      <w:lvlText w:val="%3."/>
+      <w:lvlJc w:val="right"/>
+      <w:pPr>
+        <w:ind w:left="2160" w:hanging="180"/>
+      </w:pPr>
+    </w:lvl>
+    <w:lvl w:ilvl="3" w:tplc="0C0A000F" w:tentative="1">
+      <w:start w:val="1"/>
+      <w:numFmt w:val="decimal"/>
+      <w:lvlText w:val="%4."/>
+      <w:lvlJc w:val="left"/>
+      <w:pPr>
+        <w:ind w:left="2880" w:hanging="360"/>
+      </w:pPr>
+    </w:lvl>
+    <w:lvl w:ilvl="4" w:tplc="0C0A0019" w:tentative="1">
+      <w:start w:val="1"/>
+      <w:numFmt w:val="lowerLetter"/>
+      <w:lvlText w:val="%5."/>
+      <w:lvlJc w:val="left"/>
+      <w:pPr>
+        <w:ind w:left="3600" w:hanging="360"/>
+      </w:pPr>
+    </w:lvl>
+    <w:lvl w:ilvl="5" w:tplc="0C0A001B" w:tentative="1">
+      <w:start w:val="1"/>
+      <w:numFmt w:val="lowerRoman"/>
+      <w:lvlText w:val="%6."/>
+      <w:lvlJc w:val="right"/>
+      <w:pPr>
+        <w:ind w:left="4320" w:hanging="180"/>
+      </w:pPr>
+    </w:lvl>
+    <w:lvl w:ilvl="6" w:tplc="0C0A000F" w:tentative="1">
+      <w:start w:val="1"/>
+      <w:numFmt w:val="decimal"/>
+      <w:lvlText w:val="%7."/>
+      <w:lvlJc w:val="left"/>
+      <w:pPr>
+        <w:ind w:left="5040" w:hanging="360"/>
+      </w:pPr>
+    </w:lvl>
+    <w:lvl w:ilvl="7" w:tplc="0C0A0019" w:tentative="1">
+      <w:start w:val="1"/>
+      <w:numFmt w:val="lowerLetter"/>
+      <w:lvlText w:val="%8."/>
+      <w:lvlJc w:val="left"/>
+      <w:pPr>
+        <w:ind w:left="5760" w:hanging="360"/>
+      </w:pPr>
+    </w:lvl>
+    <w:lvl w:ilvl="8" w:tplc="0C0A001B" w:tentative="1">
+      <w:start w:val="1"/>
+      <w:numFmt w:val="lowerRoman"/>
+      <w:lvlText w:val="%9."/>
+      <w:lvlJc w:val="right"/>
+      <w:pPr>
+        <w:ind w:left="6480" w:hanging="180"/>
+      </w:pPr>
+    </w:lvl>
+  </w:abstractNum>
+  <w:abstractNum w:abstractNumId="1" w15:restartNumberingAfterBreak="0">
     <w:nsid w:val="0A440A61"/>
     <w:multiLevelType w:val="hybridMultilevel"/>
     <w:tmpl w:val="0BD2B356"/>
@@ -3546,7 +5349,7 @@
       </w:pPr>
     </w:lvl>
   </w:abstractNum>
-  <w:abstractNum w:abstractNumId="1" w15:restartNumberingAfterBreak="0">
+  <w:abstractNum w:abstractNumId="2" w15:restartNumberingAfterBreak="0">
     <w:nsid w:val="11F635AD"/>
     <w:multiLevelType w:val="hybridMultilevel"/>
     <w:tmpl w:val="032C2E0A"/>
@@ -3658,7 +5461,7 @@
       </w:rPr>
     </w:lvl>
   </w:abstractNum>
-  <w:abstractNum w:abstractNumId="2" w15:restartNumberingAfterBreak="0">
+  <w:abstractNum w:abstractNumId="3" w15:restartNumberingAfterBreak="0">
     <w:nsid w:val="2EF23E3A"/>
     <w:multiLevelType w:val="hybridMultilevel"/>
     <w:tmpl w:val="0A04AF74"/>
@@ -3747,7 +5550,7 @@
       </w:pPr>
     </w:lvl>
   </w:abstractNum>
-  <w:abstractNum w:abstractNumId="3" w15:restartNumberingAfterBreak="0">
+  <w:abstractNum w:abstractNumId="4" w15:restartNumberingAfterBreak="0">
     <w:nsid w:val="34BE29DE"/>
     <w:multiLevelType w:val="hybridMultilevel"/>
     <w:tmpl w:val="BD76E808"/>
@@ -3836,7 +5639,7 @@
       </w:pPr>
     </w:lvl>
   </w:abstractNum>
-  <w:abstractNum w:abstractNumId="4" w15:restartNumberingAfterBreak="0">
+  <w:abstractNum w:abstractNumId="5" w15:restartNumberingAfterBreak="0">
     <w:nsid w:val="3CE14AE6"/>
     <w:multiLevelType w:val="hybridMultilevel"/>
     <w:tmpl w:val="50DA4CF2"/>
@@ -3925,7 +5728,96 @@
       </w:pPr>
     </w:lvl>
   </w:abstractNum>
-  <w:abstractNum w:abstractNumId="5" w15:restartNumberingAfterBreak="0">
+  <w:abstractNum w:abstractNumId="6" w15:restartNumberingAfterBreak="0">
+    <w:nsid w:val="407F0380"/>
+    <w:multiLevelType w:val="hybridMultilevel"/>
+    <w:tmpl w:val="0A04AF74"/>
+    <w:lvl w:ilvl="0" w:tplc="0C0A000F">
+      <w:start w:val="1"/>
+      <w:numFmt w:val="decimal"/>
+      <w:lvlText w:val="%1."/>
+      <w:lvlJc w:val="left"/>
+      <w:pPr>
+        <w:ind w:left="720" w:hanging="360"/>
+      </w:pPr>
+      <w:rPr>
+        <w:rFonts w:hint="default"/>
+      </w:rPr>
+    </w:lvl>
+    <w:lvl w:ilvl="1" w:tplc="0C0A0019" w:tentative="1">
+      <w:start w:val="1"/>
+      <w:numFmt w:val="lowerLetter"/>
+      <w:lvlText w:val="%2."/>
+      <w:lvlJc w:val="left"/>
+      <w:pPr>
+        <w:ind w:left="1440" w:hanging="360"/>
+      </w:pPr>
+    </w:lvl>
+    <w:lvl w:ilvl="2" w:tplc="0C0A001B" w:tentative="1">
+      <w:start w:val="1"/>
+      <w:numFmt w:val="lowerRoman"/>
+      <w:lvlText w:val="%3."/>
+      <w:lvlJc w:val="right"/>
+      <w:pPr>
+        <w:ind w:left="2160" w:hanging="180"/>
+      </w:pPr>
+    </w:lvl>
+    <w:lvl w:ilvl="3" w:tplc="0C0A000F" w:tentative="1">
+      <w:start w:val="1"/>
+      <w:numFmt w:val="decimal"/>
+      <w:lvlText w:val="%4."/>
+      <w:lvlJc w:val="left"/>
+      <w:pPr>
+        <w:ind w:left="2880" w:hanging="360"/>
+      </w:pPr>
+    </w:lvl>
+    <w:lvl w:ilvl="4" w:tplc="0C0A0019" w:tentative="1">
+      <w:start w:val="1"/>
+      <w:numFmt w:val="lowerLetter"/>
+      <w:lvlText w:val="%5."/>
+      <w:lvlJc w:val="left"/>
+      <w:pPr>
+        <w:ind w:left="3600" w:hanging="360"/>
+      </w:pPr>
+    </w:lvl>
+    <w:lvl w:ilvl="5" w:tplc="0C0A001B" w:tentative="1">
+      <w:start w:val="1"/>
+      <w:numFmt w:val="lowerRoman"/>
+      <w:lvlText w:val="%6."/>
+      <w:lvlJc w:val="right"/>
+      <w:pPr>
+        <w:ind w:left="4320" w:hanging="180"/>
+      </w:pPr>
+    </w:lvl>
+    <w:lvl w:ilvl="6" w:tplc="0C0A000F" w:tentative="1">
+      <w:start w:val="1"/>
+      <w:numFmt w:val="decimal"/>
+      <w:lvlText w:val="%7."/>
+      <w:lvlJc w:val="left"/>
+      <w:pPr>
+        <w:ind w:left="5040" w:hanging="360"/>
+      </w:pPr>
+    </w:lvl>
+    <w:lvl w:ilvl="7" w:tplc="0C0A0019" w:tentative="1">
+      <w:start w:val="1"/>
+      <w:numFmt w:val="lowerLetter"/>
+      <w:lvlText w:val="%8."/>
+      <w:lvlJc w:val="left"/>
+      <w:pPr>
+        <w:ind w:left="5760" w:hanging="360"/>
+      </w:pPr>
+    </w:lvl>
+    <w:lvl w:ilvl="8" w:tplc="0C0A001B" w:tentative="1">
+      <w:start w:val="1"/>
+      <w:numFmt w:val="lowerRoman"/>
+      <w:lvlText w:val="%9."/>
+      <w:lvlJc w:val="right"/>
+      <w:pPr>
+        <w:ind w:left="6480" w:hanging="180"/>
+      </w:pPr>
+    </w:lvl>
+  </w:abstractNum>
+  <w:abstractNum w:abstractNumId="7" w15:restartNumberingAfterBreak="0">
     <w:nsid w:val="65722387"/>
     <w:multiLevelType w:val="hybridMultilevel"/>
     <w:tmpl w:val="8D1E1C3A"/>
@@ -4014,7 +5906,96 @@
       </w:pPr>
     </w:lvl>
   </w:abstractNum>
-  <w:abstractNum w:abstractNumId="6" w15:restartNumberingAfterBreak="0">
+  <w:abstractNum w:abstractNumId="8" w15:restartNumberingAfterBreak="0">
+    <w:nsid w:val="75B314C9"/>
+    <w:multiLevelType w:val="hybridMultilevel"/>
+    <w:tmpl w:val="0A04AF74"/>
+    <w:lvl w:ilvl="0" w:tplc="0C0A000F">
+      <w:start w:val="1"/>
+      <w:numFmt w:val="decimal"/>
+      <w:lvlText w:val="%1."/>
+      <w:lvlJc w:val="left"/>
+      <w:pPr>
+        <w:ind w:left="720" w:hanging="360"/>
+      </w:pPr>
+      <w:rPr>
+        <w:rFonts w:hint="default"/>
+      </w:rPr>
+    </w:lvl>
+    <w:lvl w:ilvl="1" w:tplc="0C0A0019" w:tentative="1">
+      <w:start w:val="1"/>
+      <w:numFmt w:val="lowerLetter"/>
+      <w:lvlText w:val="%2."/>
+      <w:lvlJc w:val="left"/>
+      <w:pPr>
+        <w:ind w:left="1440" w:hanging="360"/>
+      </w:pPr>
+    </w:lvl>
+    <w:lvl w:ilvl="2" w:tplc="0C0A001B" w:tentative="1">
+      <w:start w:val="1"/>
+      <w:numFmt w:val="lowerRoman"/>
+      <w:lvlText w:val="%3."/>
+      <w:lvlJc w:val="right"/>
+      <w:pPr>
+        <w:ind w:left="2160" w:hanging="180"/>
+      </w:pPr>
+    </w:lvl>
+    <w:lvl w:ilvl="3" w:tplc="0C0A000F" w:tentative="1">
+      <w:start w:val="1"/>
+      <w:numFmt w:val="decimal"/>
+      <w:lvlText w:val="%4."/>
+      <w:lvlJc w:val="left"/>
+      <w:pPr>
+        <w:ind w:left="2880" w:hanging="360"/>
+      </w:pPr>
+    </w:lvl>
+    <w:lvl w:ilvl="4" w:tplc="0C0A0019" w:tentative="1">
+      <w:start w:val="1"/>
+      <w:numFmt w:val="lowerLetter"/>
+      <w:lvlText w:val="%5."/>
+      <w:lvlJc w:val="left"/>
+      <w:pPr>
+        <w:ind w:left="3600" w:hanging="360"/>
+      </w:pPr>
+    </w:lvl>
+    <w:lvl w:ilvl="5" w:tplc="0C0A001B" w:tentative="1">
+      <w:start w:val="1"/>
+      <w:numFmt w:val="lowerRoman"/>
+      <w:lvlText w:val="%6."/>
+      <w:lvlJc w:val="right"/>
+      <w:pPr>
+        <w:ind w:left="4320" w:hanging="180"/>
+      </w:pPr>
+    </w:lvl>
+    <w:lvl w:ilvl="6" w:tplc="0C0A000F" w:tentative="1">
+      <w:start w:val="1"/>
+      <w:numFmt w:val="decimal"/>
+      <w:lvlText w:val="%7."/>
+      <w:lvlJc w:val="left"/>
+      <w:pPr>
+        <w:ind w:left="5040" w:hanging="360"/>
+      </w:pPr>
+    </w:lvl>
+    <w:lvl w:ilvl="7" w:tplc="0C0A0019" w:tentative="1">
+      <w:start w:val="1"/>
+      <w:numFmt w:val="lowerLetter"/>
+      <w:lvlText w:val="%8."/>
+      <w:lvlJc w:val="left"/>
+      <w:pPr>
+        <w:ind w:left="5760" w:hanging="360"/>
+      </w:pPr>
+    </w:lvl>
+    <w:lvl w:ilvl="8" w:tplc="0C0A001B" w:tentative="1">
+      <w:start w:val="1"/>
+      <w:numFmt w:val="lowerRoman"/>
+      <w:lvlText w:val="%9."/>
+      <w:lvlJc w:val="right"/>
+      <w:pPr>
+        <w:ind w:left="6480" w:hanging="180"/>
+      </w:pPr>
+    </w:lvl>
+  </w:abstractNum>
+  <w:abstractNum w:abstractNumId="9" w15:restartNumberingAfterBreak="0">
     <w:nsid w:val="7C355AA5"/>
     <w:multiLevelType w:val="hybridMultilevel"/>
     <w:tmpl w:val="63A87C28"/>
@@ -4104,25 +6085,34 @@
     </w:lvl>
   </w:abstractNum>
   <w:num w:numId="1">
+    <w:abstractNumId w:val="2"/>
+  </w:num>
+  <w:num w:numId="2">
     <w:abstractNumId w:val="1"/>
   </w:num>
-  <w:num w:numId="2">
+  <w:num w:numId="3">
+    <w:abstractNumId w:val="7"/>
+  </w:num>
+  <w:num w:numId="4">
+    <w:abstractNumId w:val="4"/>
+  </w:num>
+  <w:num w:numId="5">
+    <w:abstractNumId w:val="5"/>
+  </w:num>
+  <w:num w:numId="6">
+    <w:abstractNumId w:val="9"/>
+  </w:num>
+  <w:num w:numId="7">
+    <w:abstractNumId w:val="3"/>
+  </w:num>
+  <w:num w:numId="8">
+    <w:abstractNumId w:val="8"/>
+  </w:num>
+  <w:num w:numId="9">
     <w:abstractNumId w:val="0"/>
   </w:num>
-  <w:num w:numId="3">
-    <w:abstractNumId w:val="5"/>
-  </w:num>
-  <w:num w:numId="4">
-    <w:abstractNumId w:val="3"/>
-  </w:num>
-  <w:num w:numId="5">
-    <w:abstractNumId w:val="4"/>
-  </w:num>
-  <w:num w:numId="6">
+  <w:num w:numId="10">
     <w:abstractNumId w:val="6"/>
-  </w:num>
-  <w:num w:numId="7">
-    <w:abstractNumId w:val="2"/>
   </w:num>
 </w:numbering>
 </file>
@@ -5090,6 +7080,99 @@
       <w:szCs w:val="24"/>
     </w:rPr>
   </w:style>
+  <w:style w:type="character" w:customStyle="1" w:styleId="fontstyle11">
+    <w:name w:val="fontstyle11"/>
+    <w:basedOn w:val="Fuentedeprrafopredeter"/>
+    <w:rsid w:val="00DF355C"/>
+    <w:rPr>
+      <w:rFonts w:ascii="TimesNewRomanPSMT" w:hAnsi="TimesNewRomanPSMT" w:hint="default"/>
+      <w:b w:val="0"/>
+      <w:bCs w:val="0"/>
+      <w:i w:val="0"/>
+      <w:iCs w:val="0"/>
+      <w:color w:val="000000"/>
+      <w:sz w:val="24"/>
+      <w:szCs w:val="24"/>
+    </w:rPr>
+  </w:style>
+  <w:style w:type="character" w:customStyle="1" w:styleId="fontstyle31">
+    <w:name w:val="fontstyle31"/>
+    <w:basedOn w:val="Fuentedeprrafopredeter"/>
+    <w:rsid w:val="00DF355C"/>
+    <w:rPr>
+      <w:rFonts w:ascii="Consolas" w:hAnsi="Consolas" w:hint="default"/>
+      <w:b w:val="0"/>
+      <w:bCs w:val="0"/>
+      <w:i w:val="0"/>
+      <w:iCs w:val="0"/>
+      <w:color w:val="000000"/>
+      <w:sz w:val="24"/>
+      <w:szCs w:val="24"/>
+    </w:rPr>
+  </w:style>
+  <w:style w:type="paragraph" w:styleId="Encabezado">
+    <w:name w:val="header"/>
+    <w:basedOn w:val="Normal"/>
+    <w:link w:val="EncabezadoCar"/>
+    <w:uiPriority w:val="99"/>
+    <w:unhideWhenUsed/>
+    <w:rsid w:val="00D659D3"/>
+    <w:pPr>
+      <w:tabs>
+        <w:tab w:val="center" w:pos="4252"/>
+        <w:tab w:val="right" w:pos="8504"/>
+      </w:tabs>
+      <w:spacing w:after="0" w:line="240" w:lineRule="auto"/>
+    </w:pPr>
+  </w:style>
+  <w:style w:type="character" w:customStyle="1" w:styleId="EncabezadoCar">
+    <w:name w:val="Encabezado Car"/>
+    <w:basedOn w:val="Fuentedeprrafopredeter"/>
+    <w:link w:val="Encabezado"/>
+    <w:uiPriority w:val="99"/>
+    <w:rsid w:val="00D659D3"/>
+  </w:style>
+  <w:style w:type="paragraph" w:styleId="Piedepgina">
+    <w:name w:val="footer"/>
+    <w:basedOn w:val="Normal"/>
+    <w:link w:val="PiedepginaCar"/>
+    <w:uiPriority w:val="99"/>
+    <w:unhideWhenUsed/>
+    <w:rsid w:val="00D659D3"/>
+    <w:pPr>
+      <w:tabs>
+        <w:tab w:val="center" w:pos="4252"/>
+        <w:tab w:val="right" w:pos="8504"/>
+      </w:tabs>
+      <w:spacing w:after="0" w:line="240" w:lineRule="auto"/>
+    </w:pPr>
+  </w:style>
+  <w:style w:type="character" w:customStyle="1" w:styleId="PiedepginaCar">
+    <w:name w:val="Pie de página Car"/>
+    <w:basedOn w:val="Fuentedeprrafopredeter"/>
+    <w:link w:val="Piedepgina"/>
+    <w:uiPriority w:val="99"/>
+    <w:rsid w:val="00D659D3"/>
+  </w:style>
+  <w:style w:type="paragraph" w:styleId="NormalWeb">
+    <w:name w:val="Normal (Web)"/>
+    <w:basedOn w:val="Normal"/>
+    <w:uiPriority w:val="99"/>
+    <w:semiHidden/>
+    <w:unhideWhenUsed/>
+    <w:rsid w:val="007C0079"/>
+    <w:pPr>
+      <w:spacing w:before="100" w:beforeAutospacing="1" w:after="100" w:afterAutospacing="1" w:line="240" w:lineRule="auto"/>
+    </w:pPr>
+    <w:rPr>
+      <w:rFonts w:ascii="Times New Roman" w:eastAsia="Times New Roman" w:hAnsi="Times New Roman" w:cs="Times New Roman"/>
+      <w:kern w:val="0"/>
+      <w:sz w:val="24"/>
+      <w:szCs w:val="24"/>
+      <w:lang w:eastAsia="es-ES"/>
+      <w14:ligatures w14:val="none"/>
+    </w:rPr>
+  </w:style>
 </w:styles>
 </file>
 
@@ -5393,7 +7476,7 @@
 </file>
 
 <file path=customXml/itemProps1.xml><?xml version="1.0" encoding="utf-8"?>
-<ds:datastoreItem xmlns:ds="http://schemas.openxmlformats.org/officeDocument/2006/customXml" ds:itemID="{0F3B11C7-FE6D-4E98-92AA-5765B831D9CE}">
+<ds:datastoreItem xmlns:ds="http://schemas.openxmlformats.org/officeDocument/2006/customXml" ds:itemID="{97EE8221-0971-48FD-A4A5-9E2D1E48D04B}">
   <ds:schemaRefs>
     <ds:schemaRef ds:uri="http://schemas.openxmlformats.org/officeDocument/2006/bibliography"/>
   </ds:schemaRefs>

</xml_diff>